<commit_message>
ATUALIZAÇÃO DOCUMENTAÇÃO E DIARIO DE BORDO
</commit_message>
<xml_diff>
--- a/Documentação/Diario de Bordo.docx
+++ b/Documentação/Diario de Bordo.docx
@@ -3359,7 +3359,7 @@
           <w:noProof/>
         </w:rPr>
         <w:drawing>
-          <wp:inline distT="0" distB="0" distL="0" distR="0" wp14:anchorId="0915EA7C" wp14:editId="34B26CE8">
+          <wp:inline distT="0" distB="0" distL="0" distR="0" wp14:anchorId="0915EA7C" wp14:editId="4378752C">
             <wp:extent cx="5836285" cy="1703070"/>
             <wp:effectExtent l="0" t="0" r="0" b="0"/>
             <wp:docPr id="2" name="Imagem 2"/>
@@ -4640,6 +4640,9 @@
         <w:t>8</w:t>
       </w:r>
       <w:r>
+        <w:rPr>
+          <w:noProof/>
+        </w:rPr>
         <w:fldChar w:fldCharType="end"/>
       </w:r>
       <w:r>
@@ -4709,16 +4712,7 @@
       </w:pPr>
       <w:r>
         <w:lastRenderedPageBreak/>
-        <w:t>Mudanças D</w:t>
-      </w:r>
-      <w:r>
-        <w:t>ia 2</w:t>
-      </w:r>
-      <w:r>
-        <w:t>4</w:t>
-      </w:r>
-      <w:r>
-        <w:t xml:space="preserve">/04/2026 – </w:t>
+        <w:t xml:space="preserve">Mudanças Dia 24/04/2026 – </w:t>
       </w:r>
       <w:r>
         <w:t>Documentação das telas d</w:t>
@@ -4765,6 +4759,9 @@
         <w:t>9</w:t>
       </w:r>
       <w:r>
+        <w:rPr>
+          <w:noProof/>
+        </w:rPr>
         <w:fldChar w:fldCharType="end"/>
       </w:r>
       <w:r>
@@ -4828,11 +4825,265 @@
         <w:t>Fonte: Feito por Os Autores</w:t>
       </w:r>
     </w:p>
+    <w:p/>
+    <w:p>
+      <w:pPr>
+        <w:pStyle w:val="Ttulo1"/>
+      </w:pPr>
+      <w:r>
+        <w:t xml:space="preserve">Aula dia 29/04/2026 – </w:t>
+      </w:r>
+    </w:p>
+    <w:p>
+      <w:pPr>
+        <w:pStyle w:val="ParagrafoTCC2025"/>
+      </w:pPr>
+      <w:r>
+        <w:t>Neste dia o Professor Emerson Rodrigues disponibilizou um novo documento para base da Documentação do TCC, onde a seção de Arquitetura sofreu alterações.</w:t>
+      </w:r>
+    </w:p>
+    <w:p>
+      <w:pPr>
+        <w:pStyle w:val="Legenda"/>
+        <w:keepNext/>
+      </w:pPr>
+      <w:r>
+        <w:t xml:space="preserve">Figura </w:t>
+      </w:r>
+      <w:r>
+        <w:fldChar w:fldCharType="begin"/>
+      </w:r>
+      <w:r>
+        <w:instrText xml:space="preserve"> SEQ Figura \* ARABIC </w:instrText>
+      </w:r>
+      <w:r>
+        <w:fldChar w:fldCharType="separate"/>
+      </w:r>
+      <w:r>
+        <w:rPr>
+          <w:noProof/>
+        </w:rPr>
+        <w:t>10</w:t>
+      </w:r>
+      <w:r>
+        <w:fldChar w:fldCharType="end"/>
+      </w:r>
+      <w:r>
+        <w:t xml:space="preserve"> – E-mail enviado pelo professor Emerson Rodrigues</w:t>
+      </w:r>
+    </w:p>
     <w:p>
       <w:pPr>
         <w:pStyle w:val="ImagemTCC2026"/>
-        <w:ind w:left="0" w:firstLine="0"/>
-        <w:jc w:val="both"/>
+        <w:keepNext/>
+      </w:pPr>
+      <w:r>
+        <w:drawing>
+          <wp:inline distT="0" distB="0" distL="0" distR="0" wp14:anchorId="7D942DD1" wp14:editId="018BA65B">
+            <wp:extent cx="5836285" cy="1731645"/>
+            <wp:effectExtent l="0" t="0" r="0" b="1905"/>
+            <wp:docPr id="11" name="Imagem 11"/>
+            <wp:cNvGraphicFramePr>
+              <a:graphicFrameLocks xmlns:a="http://schemas.openxmlformats.org/drawingml/2006/main" noChangeAspect="1"/>
+            </wp:cNvGraphicFramePr>
+            <a:graphic xmlns:a="http://schemas.openxmlformats.org/drawingml/2006/main">
+              <a:graphicData uri="http://schemas.openxmlformats.org/drawingml/2006/picture">
+                <pic:pic xmlns:pic="http://schemas.openxmlformats.org/drawingml/2006/picture">
+                  <pic:nvPicPr>
+                    <pic:cNvPr id="1" name=""/>
+                    <pic:cNvPicPr/>
+                  </pic:nvPicPr>
+                  <pic:blipFill>
+                    <a:blip r:embed="rId20"/>
+                    <a:stretch>
+                      <a:fillRect/>
+                    </a:stretch>
+                  </pic:blipFill>
+                  <pic:spPr>
+                    <a:xfrm>
+                      <a:off x="0" y="0"/>
+                      <a:ext cx="5836285" cy="1731645"/>
+                    </a:xfrm>
+                    <a:prstGeom prst="rect">
+                      <a:avLst/>
+                    </a:prstGeom>
+                  </pic:spPr>
+                </pic:pic>
+              </a:graphicData>
+            </a:graphic>
+          </wp:inline>
+        </w:drawing>
+      </w:r>
+    </w:p>
+    <w:p>
+      <w:pPr>
+        <w:pStyle w:val="FonteTCC2025"/>
+      </w:pPr>
+      <w:r>
+        <w:t xml:space="preserve">Fonte: </w:t>
+      </w:r>
+      <w:proofErr w:type="spellStart"/>
+      <w:r>
+        <w:t>Disponilizado</w:t>
+      </w:r>
+      <w:proofErr w:type="spellEnd"/>
+      <w:r>
+        <w:t xml:space="preserve"> pelo Professor Emerson Rodrigues</w:t>
+      </w:r>
+    </w:p>
+    <w:p>
+      <w:pPr>
+        <w:pStyle w:val="Ttulo1"/>
+      </w:pPr>
+      <w:r>
+        <w:t xml:space="preserve">Aula dia </w:t>
+      </w:r>
+      <w:r>
+        <w:t>01</w:t>
+      </w:r>
+      <w:r>
+        <w:t>/0</w:t>
+      </w:r>
+      <w:r>
+        <w:t>5</w:t>
+      </w:r>
+      <w:r>
+        <w:t xml:space="preserve">/2026 – </w:t>
+      </w:r>
+    </w:p>
+    <w:p>
+      <w:pPr>
+        <w:pStyle w:val="ParagrafoTCC2025"/>
+      </w:pPr>
+      <w:r>
+        <w:t>Neste dia não houve aula devido ao feriado do Dia do Trabalhador.</w:t>
+      </w:r>
+    </w:p>
+    <w:p>
+      <w:pPr>
+        <w:pStyle w:val="Ttulo1"/>
+      </w:pPr>
+      <w:r>
+        <w:t>Reunião</w:t>
+      </w:r>
+      <w:r>
+        <w:t xml:space="preserve"> dia 0</w:t>
+      </w:r>
+      <w:r>
+        <w:t>4</w:t>
+      </w:r>
+      <w:r>
+        <w:t xml:space="preserve">/05/2026 – </w:t>
+      </w:r>
+      <w:r>
+        <w:t>Alinhamento de objetivos</w:t>
+      </w:r>
+    </w:p>
+    <w:p>
+      <w:r>
+        <w:t>Neste dia foi realizado uma reunião para conferir objetivos, andamentos da realização de programação, complemento e mudanças na Documentação do projeto.</w:t>
+      </w:r>
+    </w:p>
+    <w:p/>
+    <w:p>
+      <w:pPr>
+        <w:pStyle w:val="Legenda"/>
+        <w:keepNext/>
+      </w:pPr>
+      <w:r>
+        <w:t xml:space="preserve">Figura </w:t>
+      </w:r>
+      <w:r>
+        <w:fldChar w:fldCharType="begin"/>
+      </w:r>
+      <w:r>
+        <w:instrText xml:space="preserve"> SEQ Figura \* ARABIC </w:instrText>
+      </w:r>
+      <w:r>
+        <w:fldChar w:fldCharType="separate"/>
+      </w:r>
+      <w:r>
+        <w:rPr>
+          <w:noProof/>
+        </w:rPr>
+        <w:t>11</w:t>
+      </w:r>
+      <w:r>
+        <w:fldChar w:fldCharType="end"/>
+      </w:r>
+      <w:r>
+        <w:t xml:space="preserve"> - Print do Aplicativo de Comunicação </w:t>
+      </w:r>
+      <w:proofErr w:type="spellStart"/>
+      <w:r>
+        <w:t>Discord</w:t>
+      </w:r>
+      <w:proofErr w:type="spellEnd"/>
+    </w:p>
+    <w:p>
+      <w:pPr>
+        <w:pStyle w:val="ImagemTCC2026"/>
+      </w:pPr>
+      <w:r>
+        <w:drawing>
+          <wp:inline distT="0" distB="0" distL="0" distR="0" wp14:anchorId="68A74BB8" wp14:editId="7510B2CC">
+            <wp:extent cx="2667372" cy="1343212"/>
+            <wp:effectExtent l="0" t="0" r="0" b="9525"/>
+            <wp:docPr id="12" name="Imagem 12"/>
+            <wp:cNvGraphicFramePr>
+              <a:graphicFrameLocks xmlns:a="http://schemas.openxmlformats.org/drawingml/2006/main" noChangeAspect="1"/>
+            </wp:cNvGraphicFramePr>
+            <a:graphic xmlns:a="http://schemas.openxmlformats.org/drawingml/2006/main">
+              <a:graphicData uri="http://schemas.openxmlformats.org/drawingml/2006/picture">
+                <pic:pic xmlns:pic="http://schemas.openxmlformats.org/drawingml/2006/picture">
+                  <pic:nvPicPr>
+                    <pic:cNvPr id="1" name=""/>
+                    <pic:cNvPicPr/>
+                  </pic:nvPicPr>
+                  <pic:blipFill>
+                    <a:blip r:embed="rId21"/>
+                    <a:stretch>
+                      <a:fillRect/>
+                    </a:stretch>
+                  </pic:blipFill>
+                  <pic:spPr>
+                    <a:xfrm>
+                      <a:off x="0" y="0"/>
+                      <a:ext cx="2667372" cy="1343212"/>
+                    </a:xfrm>
+                    <a:prstGeom prst="rect">
+                      <a:avLst/>
+                    </a:prstGeom>
+                  </pic:spPr>
+                </pic:pic>
+              </a:graphicData>
+            </a:graphic>
+          </wp:inline>
+        </w:drawing>
+      </w:r>
+    </w:p>
+    <w:p>
+      <w:pPr>
+        <w:pStyle w:val="FonteTCC2025"/>
+      </w:pPr>
+      <w:r>
+        <w:t xml:space="preserve">Fonte: Aplicativo </w:t>
+      </w:r>
+      <w:proofErr w:type="spellStart"/>
+      <w:r>
+        <w:t>Discord</w:t>
+      </w:r>
+      <w:proofErr w:type="spellEnd"/>
+    </w:p>
+    <w:p>
+      <w:pPr>
+        <w:pStyle w:val="FonteTCC2025"/>
+      </w:pPr>
+    </w:p>
+    <w:p/>
+    <w:p>
+      <w:pPr>
+        <w:pStyle w:val="FiguraTCC"/>
       </w:pPr>
     </w:p>
     <w:p>
@@ -4891,7 +5142,7 @@
       <w:r>
         <w:br/>
       </w:r>
-      <w:hyperlink r:id="rId20" w:history="1">
+      <w:hyperlink r:id="rId22" w:history="1">
         <w:r>
           <w:rPr>
             <w:rStyle w:val="Hyperlink"/>
@@ -4925,7 +5176,7 @@
       <w:r>
         <w:t xml:space="preserve"> – Ferramenta colaborativa de design de interfaces. Disponível em: </w:t>
       </w:r>
-      <w:hyperlink r:id="rId21" w:history="1">
+      <w:hyperlink r:id="rId23" w:history="1">
         <w:r>
           <w:rPr>
             <w:rStyle w:val="Hyperlink"/>
@@ -4967,7 +5218,7 @@
       <w:r>
         <w:t xml:space="preserve">. Disponível em: </w:t>
       </w:r>
-      <w:hyperlink r:id="rId22" w:history="1">
+      <w:hyperlink r:id="rId24" w:history="1">
         <w:r>
           <w:rPr>
             <w:rStyle w:val="Hyperlink"/>
@@ -5013,7 +5264,7 @@
       <w:r>
         <w:t xml:space="preserve"> – Plataforma de criação visual. Disponível em: </w:t>
       </w:r>
-      <w:hyperlink r:id="rId23" w:history="1">
+      <w:hyperlink r:id="rId25" w:history="1">
         <w:r>
           <w:rPr>
             <w:rStyle w:val="Hyperlink"/>
@@ -5071,7 +5322,7 @@
       <w:r>
         <w:t xml:space="preserve"> – Hospedagem de código e controle de versão. Disponível em: </w:t>
       </w:r>
-      <w:hyperlink r:id="rId24" w:history="1">
+      <w:hyperlink r:id="rId26" w:history="1">
         <w:r>
           <w:rPr>
             <w:rStyle w:val="Hyperlink"/>
@@ -5092,7 +5343,24 @@
         </w:r>
       </w:hyperlink>
       <w:r>
-        <w:t>. Acesso em: 31 jul. 2025.</w:t>
+        <w:t xml:space="preserve">. Acesso em: </w:t>
+      </w:r>
+      <w:r>
+        <w:t>14</w:t>
+      </w:r>
+      <w:r>
+        <w:t xml:space="preserve"> </w:t>
+      </w:r>
+      <w:proofErr w:type="spellStart"/>
+      <w:r>
+        <w:t>abrl</w:t>
+      </w:r>
+      <w:proofErr w:type="spellEnd"/>
+      <w:r>
+        <w:t>. 2026</w:t>
+      </w:r>
+      <w:r>
+        <w:t>.</w:t>
       </w:r>
     </w:p>
     <w:p>
@@ -5117,7 +5385,7 @@
       <w:r>
         <w:t xml:space="preserve"> – Sistema de controle de versão distribuído. Disponível em: </w:t>
       </w:r>
-      <w:hyperlink r:id="rId25" w:history="1">
+      <w:hyperlink r:id="rId27" w:history="1">
         <w:r>
           <w:rPr>
             <w:rStyle w:val="Hyperlink"/>
@@ -5126,7 +5394,19 @@
         </w:r>
       </w:hyperlink>
       <w:r>
-        <w:t>. Acesso em: 23 nov. 2024.</w:t>
+        <w:t xml:space="preserve">. Acesso em: </w:t>
+      </w:r>
+      <w:r>
+        <w:t>14</w:t>
+      </w:r>
+      <w:r>
+        <w:t xml:space="preserve"> </w:t>
+      </w:r>
+      <w:r>
+        <w:t>abril. 2026</w:t>
+      </w:r>
+      <w:r>
+        <w:t>.</w:t>
       </w:r>
     </w:p>
     <w:p>
@@ -5151,7 +5431,7 @@
       <w:r>
         <w:t xml:space="preserve"> – Ícones Vetoriais. Disponível em: </w:t>
       </w:r>
-      <w:hyperlink r:id="rId26" w:history="1">
+      <w:hyperlink r:id="rId28" w:history="1">
         <w:r>
           <w:rPr>
             <w:rStyle w:val="Hyperlink"/>
@@ -5185,7 +5465,7 @@
       <w:r>
         <w:t xml:space="preserve"> – Ícones e vetores. Disponível em: </w:t>
       </w:r>
-      <w:hyperlink r:id="rId27" w:history="1">
+      <w:hyperlink r:id="rId29" w:history="1">
         <w:r>
           <w:rPr>
             <w:rStyle w:val="Hyperlink"/>
@@ -5219,7 +5499,7 @@
       <w:r>
         <w:t xml:space="preserve"> – Editor de imagens online. Disponível em: </w:t>
       </w:r>
-      <w:hyperlink r:id="rId28" w:history="1">
+      <w:hyperlink r:id="rId30" w:history="1">
         <w:r>
           <w:rPr>
             <w:rStyle w:val="Hyperlink"/>
@@ -5253,7 +5533,7 @@
       <w:r>
         <w:t xml:space="preserve"> Web – Ferramenta de modelagem de banco de dados. Disponível em: </w:t>
       </w:r>
-      <w:hyperlink r:id="rId29" w:history="1">
+      <w:hyperlink r:id="rId31" w:history="1">
         <w:r>
           <w:rPr>
             <w:rStyle w:val="Hyperlink"/>
@@ -5287,7 +5567,7 @@
       <w:r>
         <w:t xml:space="preserve"> – Framework PHP para desenvolvimento web. Disponível em: </w:t>
       </w:r>
-      <w:hyperlink r:id="rId30" w:history="1">
+      <w:hyperlink r:id="rId32" w:history="1">
         <w:r>
           <w:rPr>
             <w:rStyle w:val="Hyperlink"/>
@@ -5296,7 +5576,10 @@
         </w:r>
       </w:hyperlink>
       <w:r>
-        <w:t>. Acesso em: 10 set. 2025.</w:t>
+        <w:t>. Acesso em: 14 abril. 2026</w:t>
+      </w:r>
+      <w:r>
+        <w:t>.</w:t>
       </w:r>
     </w:p>
     <w:p>
@@ -5329,7 +5612,7 @@
       <w:r>
         <w:t xml:space="preserve"> e mensagens em tempo real. Disponível em: </w:t>
       </w:r>
-      <w:hyperlink r:id="rId31" w:history="1">
+      <w:hyperlink r:id="rId33" w:history="1">
         <w:r>
           <w:rPr>
             <w:rStyle w:val="Hyperlink"/>
@@ -5358,7 +5641,7 @@
       <w:r>
         <w:t xml:space="preserve"> Gemini – Ferramenta de IA para textos e análises. Disponível em: </w:t>
       </w:r>
-      <w:hyperlink r:id="rId32" w:history="1">
+      <w:hyperlink r:id="rId34" w:history="1">
         <w:r>
           <w:rPr>
             <w:rStyle w:val="Hyperlink"/>
@@ -6035,19 +6318,19 @@
       </w:rPr>
     </w:lvl>
   </w:abstractNum>
-  <w:num w:numId="1" w16cid:durableId="504563550">
+  <w:num w:numId="1" w16cid:durableId="380906349">
     <w:abstractNumId w:val="3"/>
   </w:num>
-  <w:num w:numId="2" w16cid:durableId="1899974029">
+  <w:num w:numId="2" w16cid:durableId="187449634">
     <w:abstractNumId w:val="0"/>
   </w:num>
-  <w:num w:numId="3" w16cid:durableId="89394975">
+  <w:num w:numId="3" w16cid:durableId="1583954357">
     <w:abstractNumId w:val="1"/>
   </w:num>
-  <w:num w:numId="4" w16cid:durableId="1066533568">
+  <w:num w:numId="4" w16cid:durableId="406272489">
     <w:abstractNumId w:val="4"/>
   </w:num>
-  <w:num w:numId="5" w16cid:durableId="367682868">
+  <w:num w:numId="5" w16cid:durableId="1417048468">
     <w:abstractNumId w:val="2"/>
   </w:num>
 </w:numbering>
@@ -6491,6 +6774,7 @@
   <w:style w:type="character" w:default="1" w:styleId="Fontepargpadro">
     <w:name w:val="Default Paragraph Font"/>
     <w:uiPriority w:val="1"/>
+    <w:semiHidden/>
     <w:unhideWhenUsed/>
   </w:style>
   <w:style w:type="table" w:default="1" w:styleId="Tabelanormal">
@@ -7232,7 +7516,7 @@
 </file>
 
 <file path=customXml/itemProps1.xml><?xml version="1.0" encoding="utf-8"?>
-<ds:datastoreItem xmlns:ds="http://schemas.openxmlformats.org/officeDocument/2006/customXml" ds:itemID="{053C111E-C6E1-4EC7-85D9-E84467E9F423}">
+<ds:datastoreItem xmlns:ds="http://schemas.openxmlformats.org/officeDocument/2006/customXml" ds:itemID="{190F74C1-1282-4B42-8D3D-90304B067312}">
   <ds:schemaRefs>
     <ds:schemaRef ds:uri="http://schemas.openxmlformats.org/officeDocument/2006/bibliography"/>
   </ds:schemaRefs>

</xml_diff>

<commit_message>
Atualização Diario de Bordo
</commit_message>
<xml_diff>
--- a/Documentação/Diario de Bordo.docx
+++ b/Documentação/Diario de Bordo.docx
@@ -80,23 +80,25 @@
           <w:sz w:val="28"/>
           <w:szCs w:val="24"/>
         </w:rPr>
-        <w:t>Enzo Heitor Spineli</w:t>
-      </w:r>
+        <w:t xml:space="preserve">Enzo Heitor </w:t>
+      </w:r>
+      <w:proofErr w:type="spellStart"/>
       <w:r>
         <w:rPr>
           <w:b/>
           <w:sz w:val="28"/>
           <w:szCs w:val="24"/>
         </w:rPr>
-        <w:br/>
-      </w:r>
+        <w:t>Spineli</w:t>
+      </w:r>
+      <w:proofErr w:type="spellEnd"/>
       <w:r>
         <w:rPr>
           <w:b/>
           <w:sz w:val="28"/>
           <w:szCs w:val="24"/>
         </w:rPr>
-        <w:t>Enzo Simon Moscoso</w:t>
+        <w:br/>
       </w:r>
       <w:r>
         <w:rPr>
@@ -104,7 +106,7 @@
           <w:sz w:val="28"/>
           <w:szCs w:val="24"/>
         </w:rPr>
-        <w:br/>
+        <w:t>Enzo Simon Moscoso</w:t>
       </w:r>
       <w:r>
         <w:rPr>
@@ -112,6 +114,14 @@
           <w:sz w:val="28"/>
           <w:szCs w:val="24"/>
         </w:rPr>
+        <w:br/>
+      </w:r>
+      <w:r>
+        <w:rPr>
+          <w:b/>
+          <w:sz w:val="28"/>
+          <w:szCs w:val="24"/>
+        </w:rPr>
         <w:t>Júlio Cesar Rossini</w:t>
       </w:r>
     </w:p>
@@ -220,23 +230,25 @@
           <w:szCs w:val="24"/>
         </w:rPr>
         <w:br/>
-        <w:t>Enzo Heitor Spineli</w:t>
-      </w:r>
+        <w:t xml:space="preserve">Enzo Heitor </w:t>
+      </w:r>
+      <w:proofErr w:type="spellStart"/>
       <w:r>
         <w:rPr>
           <w:b/>
           <w:sz w:val="28"/>
           <w:szCs w:val="24"/>
         </w:rPr>
-        <w:br/>
-      </w:r>
+        <w:t>Spineli</w:t>
+      </w:r>
+      <w:proofErr w:type="spellEnd"/>
       <w:r>
         <w:rPr>
           <w:b/>
           <w:sz w:val="28"/>
           <w:szCs w:val="24"/>
         </w:rPr>
-        <w:t>Enzo Simon Moscoso</w:t>
+        <w:br/>
       </w:r>
       <w:r>
         <w:rPr>
@@ -244,7 +256,7 @@
           <w:sz w:val="28"/>
           <w:szCs w:val="24"/>
         </w:rPr>
-        <w:br/>
+        <w:t>Enzo Simon Moscoso</w:t>
       </w:r>
       <w:r>
         <w:rPr>
@@ -252,6 +264,14 @@
           <w:sz w:val="28"/>
           <w:szCs w:val="24"/>
         </w:rPr>
+        <w:br/>
+      </w:r>
+      <w:r>
+        <w:rPr>
+          <w:b/>
+          <w:sz w:val="28"/>
+          <w:szCs w:val="24"/>
+        </w:rPr>
         <w:t>Júlio Cesar Rossini</w:t>
       </w:r>
     </w:p>
@@ -285,7 +305,21 @@
         <w:rPr>
           <w:szCs w:val="24"/>
         </w:rPr>
-        <w:t>Trabalho de Conclusão de Curso apresentado ao Curso de Ensino Médio com Habilitação Profissional de Técnico em Desenvolvimento de Sistemas da Etec João Belarmino sob orientação do Prof. Emerson Rodrigo Baião, como requisito mínimo para obtenção do título de Técnico em Desenvolvimento de Sistemas.</w:t>
+        <w:t xml:space="preserve">Trabalho de Conclusão de Curso apresentado ao Curso de Ensino Médio com Habilitação Profissional de Técnico em Desenvolvimento de Sistemas da </w:t>
+      </w:r>
+      <w:proofErr w:type="spellStart"/>
+      <w:r>
+        <w:rPr>
+          <w:szCs w:val="24"/>
+        </w:rPr>
+        <w:t>Etec</w:t>
+      </w:r>
+      <w:proofErr w:type="spellEnd"/>
+      <w:r>
+        <w:rPr>
+          <w:szCs w:val="24"/>
+        </w:rPr>
+        <w:t xml:space="preserve"> João Belarmino sob orientação do Prof. Emerson Rodrigo Baião, como requisito mínimo para obtenção do título de Técnico em Desenvolvimento de Sistemas.</w:t>
       </w:r>
     </w:p>
     <w:p>
@@ -3801,6 +3835,7 @@
       <w:r>
         <w:t xml:space="preserve"> </w:t>
       </w:r>
+      <w:proofErr w:type="spellStart"/>
       <w:r>
         <w:rPr>
           <w:rStyle w:val="Ttulo1Char"/>
@@ -3810,10 +3845,19 @@
       </w:r>
       <w:bookmarkEnd w:id="5"/>
       <w:bookmarkEnd w:id="6"/>
-    </w:p>
-    <w:p>
-      <w:r>
-        <w:t>Nesse dia as duas últimas aulas ficaram disponível para o CarnaLiceu.</w:t>
+      <w:proofErr w:type="spellEnd"/>
+    </w:p>
+    <w:p>
+      <w:r>
+        <w:t xml:space="preserve">Nesse dia as duas últimas aulas ficaram disponível para o </w:t>
+      </w:r>
+      <w:proofErr w:type="spellStart"/>
+      <w:r>
+        <w:t>CarnaLiceu</w:t>
+      </w:r>
+      <w:proofErr w:type="spellEnd"/>
+      <w:r>
+        <w:t>.</w:t>
       </w:r>
     </w:p>
     <w:p>
@@ -4183,7 +4227,7 @@
       </w:pPr>
       <w:r>
         <w:drawing>
-          <wp:inline distT="0" distB="0" distL="0" distR="0" wp14:anchorId="0915EA7C" wp14:editId="2FB702F5">
+          <wp:inline distT="0" distB="0" distL="0" distR="0" wp14:anchorId="0915EA7C" wp14:editId="10477342">
             <wp:extent cx="5836285" cy="1703070"/>
             <wp:effectExtent l="0" t="0" r="0" b="0"/>
             <wp:docPr id="2" name="Imagem 2"/>
@@ -4289,7 +4333,15 @@
         <w:pStyle w:val="ParagrafoTCC2025"/>
       </w:pPr>
       <w:r>
-        <w:t>A outra metade do grupo criou contas no site Figma e começaram a criar os exemplos de como seria o design das páginas do site. Abaixou o exemplo da página de login:</w:t>
+        <w:t xml:space="preserve">A outra metade do grupo criou contas no site </w:t>
+      </w:r>
+      <w:proofErr w:type="spellStart"/>
+      <w:r>
+        <w:t>Figma</w:t>
+      </w:r>
+      <w:proofErr w:type="spellEnd"/>
+      <w:r>
+        <w:t xml:space="preserve"> e começaram a criar os exemplos de como seria o design das páginas do site. Abaixou o exemplo da página de login:</w:t>
       </w:r>
     </w:p>
     <w:p>
@@ -4297,7 +4349,23 @@
         <w:pStyle w:val="ParagrafoTCC2025"/>
       </w:pPr>
       <w:r>
-        <w:t>Essa foi a ideia inicial para o projeto, que mais tarde seria alterada. Seria utilizado o Visual Studio Code (VS Code) durante boa parte da programação do projeto.</w:t>
+        <w:t xml:space="preserve">Essa foi a ideia inicial para o projeto, que mais tarde seria alterada. Seria utilizado o Visual Studio </w:t>
+      </w:r>
+      <w:proofErr w:type="spellStart"/>
+      <w:r>
+        <w:t>Code</w:t>
+      </w:r>
+      <w:proofErr w:type="spellEnd"/>
+      <w:r>
+        <w:t xml:space="preserve"> (VS </w:t>
+      </w:r>
+      <w:proofErr w:type="spellStart"/>
+      <w:r>
+        <w:t>Code</w:t>
+      </w:r>
+      <w:proofErr w:type="spellEnd"/>
+      <w:r>
+        <w:t>) durante boa parte da programação do projeto.</w:t>
       </w:r>
     </w:p>
     <w:p>
@@ -4316,7 +4384,23 @@
         <w:pStyle w:val="ParagrafoTCC2025"/>
       </w:pPr>
       <w:r>
-        <w:t>Foi Realizada uma reunião no aplicativo Discord para discussão e conscentimento do tema final do projeto.</w:t>
+        <w:t xml:space="preserve">Foi Realizada uma reunião no aplicativo </w:t>
+      </w:r>
+      <w:proofErr w:type="spellStart"/>
+      <w:r>
+        <w:t>Discord</w:t>
+      </w:r>
+      <w:proofErr w:type="spellEnd"/>
+      <w:r>
+        <w:t xml:space="preserve"> para discussão e </w:t>
+      </w:r>
+      <w:proofErr w:type="spellStart"/>
+      <w:r>
+        <w:t>conscentimento</w:t>
+      </w:r>
+      <w:proofErr w:type="spellEnd"/>
+      <w:r>
+        <w:t xml:space="preserve"> do tema final do projeto.</w:t>
       </w:r>
     </w:p>
     <w:p>
@@ -4337,7 +4421,23 @@
         <w:pStyle w:val="ParagrafoTCC2025"/>
       </w:pPr>
       <w:r>
-        <w:t>Foi Realizada uma reunião no aplicativo Discord para uso e aprendizado da ferramenta Figma AI para prototipagem e ideias prévias do Projeto</w:t>
+        <w:t xml:space="preserve">Foi Realizada uma reunião no aplicativo </w:t>
+      </w:r>
+      <w:proofErr w:type="spellStart"/>
+      <w:r>
+        <w:t>Discord</w:t>
+      </w:r>
+      <w:proofErr w:type="spellEnd"/>
+      <w:r>
+        <w:t xml:space="preserve"> para uso e aprendizado da ferramenta </w:t>
+      </w:r>
+      <w:proofErr w:type="spellStart"/>
+      <w:r>
+        <w:t>Figma</w:t>
+      </w:r>
+      <w:proofErr w:type="spellEnd"/>
+      <w:r>
+        <w:t xml:space="preserve"> AI para prototipagem e ideias prévias do Projeto</w:t>
       </w:r>
     </w:p>
     <w:p>
@@ -4363,7 +4463,15 @@
         <w:pStyle w:val="ParagrafoTCC2025"/>
       </w:pPr>
       <w:r>
-        <w:t>A outra metade do grupo criou contas no site Figma e começaram a criar os exemplos de como seria o design das páginas do site. Abaixou o exemplo da página de login:</w:t>
+        <w:t xml:space="preserve">A outra metade do grupo criou contas no site </w:t>
+      </w:r>
+      <w:proofErr w:type="spellStart"/>
+      <w:r>
+        <w:t>Figma</w:t>
+      </w:r>
+      <w:proofErr w:type="spellEnd"/>
+      <w:r>
+        <w:t xml:space="preserve"> e começaram a criar os exemplos de como seria o design das páginas do site. Abaixou o exemplo da página de login:</w:t>
       </w:r>
     </w:p>
     <w:p>
@@ -4371,7 +4479,23 @@
         <w:pStyle w:val="ParagrafoTCC2025"/>
       </w:pPr>
       <w:r>
-        <w:t>Essa foi a ideia inicial para o projeto, que mais tarde seria alterada. Seria utilizado o Visual Studio Code (VS Code) durante boa parte da programação do projeto.</w:t>
+        <w:t xml:space="preserve">Essa foi a ideia inicial para o projeto, que mais tarde seria alterada. Seria utilizado o Visual Studio </w:t>
+      </w:r>
+      <w:proofErr w:type="spellStart"/>
+      <w:r>
+        <w:t>Code</w:t>
+      </w:r>
+      <w:proofErr w:type="spellEnd"/>
+      <w:r>
+        <w:t xml:space="preserve"> (VS </w:t>
+      </w:r>
+      <w:proofErr w:type="spellStart"/>
+      <w:r>
+        <w:t>Code</w:t>
+      </w:r>
+      <w:proofErr w:type="spellEnd"/>
+      <w:r>
+        <w:t>) durante boa parte da programação do projeto.</w:t>
       </w:r>
     </w:p>
     <w:p>
@@ -4380,16 +4504,29 @@
       </w:pPr>
       <w:bookmarkStart w:id="19" w:name="_Toc228997828"/>
       <w:r>
-        <w:t>Reunião dia 11/03/2026 – Definição de base para Front-End</w:t>
+        <w:t>Reunião dia 11/03/2026 – Definição de base para Front-</w:t>
+      </w:r>
+      <w:proofErr w:type="spellStart"/>
+      <w:r>
+        <w:t>End</w:t>
       </w:r>
       <w:bookmarkEnd w:id="19"/>
+      <w:proofErr w:type="spellEnd"/>
     </w:p>
     <w:p>
       <w:pPr>
         <w:pStyle w:val="ParagrafoTCC2025"/>
       </w:pPr>
       <w:r>
-        <w:t>Uso da Ferramenta Figma AI para criação de um modelo base para Front-End</w:t>
+        <w:t xml:space="preserve">Uso da Ferramenta </w:t>
+      </w:r>
+      <w:proofErr w:type="spellStart"/>
+      <w:r>
+        <w:t>Figma</w:t>
+      </w:r>
+      <w:proofErr w:type="spellEnd"/>
+      <w:r>
+        <w:t xml:space="preserve"> AI para criação de um modelo base para Front-End</w:t>
       </w:r>
       <w:r>
         <w:t>.</w:t>
@@ -4428,9 +4565,14 @@
         <w:t xml:space="preserve"> -</w:t>
       </w:r>
       <w:r>
-        <w:t xml:space="preserve"> Modelo base definido para Fron-End</w:t>
+        <w:t xml:space="preserve"> Modelo base definido para </w:t>
+      </w:r>
+      <w:proofErr w:type="spellStart"/>
+      <w:r>
+        <w:t>Fron-End</w:t>
       </w:r>
       <w:bookmarkEnd w:id="20"/>
+      <w:proofErr w:type="spellEnd"/>
     </w:p>
     <w:p>
       <w:pPr>
@@ -4517,13 +4659,29 @@
         <w:pStyle w:val="ParagrafoTCC2025"/>
       </w:pPr>
       <w:r>
-        <w:t>Os grupos foram divididos, os devops ficaram pro</w:t>
+        <w:t xml:space="preserve">Os grupos foram divididos, os </w:t>
+      </w:r>
+      <w:proofErr w:type="spellStart"/>
+      <w:r>
+        <w:t>devops</w:t>
+      </w:r>
+      <w:proofErr w:type="spellEnd"/>
+      <w:r>
+        <w:t xml:space="preserve"> ficaram </w:t>
+      </w:r>
+      <w:proofErr w:type="spellStart"/>
+      <w:r>
+        <w:t>pro</w:t>
       </w:r>
       <w:r>
         <w:t>to</w:t>
       </w:r>
       <w:r>
-        <w:t>tipando, enquanto os responsáveis pela gestão e documentação, aprenderam as regras de gerenciamento e de organização da documentação.</w:t>
+        <w:t>tipando</w:t>
+      </w:r>
+      <w:proofErr w:type="spellEnd"/>
+      <w:r>
+        <w:t>, enquanto os responsáveis pela gestão e documentação, aprenderam as regras de gerenciamento e de organização da documentação.</w:t>
       </w:r>
     </w:p>
     <w:p>
@@ -4531,7 +4689,15 @@
         <w:pStyle w:val="ParagrafoTCC2025"/>
       </w:pPr>
       <w:r>
-        <w:t xml:space="preserve">Nessa aula, o professor encaminhou por e-mail toda a documentação que regulamenta o TCC nas Etecs. Na Figura </w:t>
+        <w:t xml:space="preserve">Nessa aula, o professor encaminhou por e-mail toda a documentação que regulamenta o TCC nas </w:t>
+      </w:r>
+      <w:proofErr w:type="spellStart"/>
+      <w:r>
+        <w:t>Etecs</w:t>
+      </w:r>
+      <w:proofErr w:type="spellEnd"/>
+      <w:r>
+        <w:t xml:space="preserve">. Na Figura </w:t>
       </w:r>
       <w:r>
         <w:t>a</w:t>
@@ -4627,7 +4793,15 @@
         <w:pStyle w:val="FonteTCC2025"/>
       </w:pPr>
       <w:r>
-        <w:t>Fonte: Imagem cedida por Heitor Simoneti do e-mail enviado pelo professor</w:t>
+        <w:t xml:space="preserve">Fonte: Imagem cedida por Heitor </w:t>
+      </w:r>
+      <w:proofErr w:type="spellStart"/>
+      <w:r>
+        <w:t>Simoneti</w:t>
+      </w:r>
+      <w:proofErr w:type="spellEnd"/>
+      <w:r>
+        <w:t xml:space="preserve"> do e-mail enviado pelo professor</w:t>
       </w:r>
     </w:p>
     <w:p>
@@ -4679,7 +4853,15 @@
         <w:pStyle w:val="ParagrafoTCC2025"/>
       </w:pPr>
       <w:r>
-        <w:t>Nesse dia, o membro Enzo Spineli faltou em aula para realizar o levantamento de requisitos com sua tia.</w:t>
+        <w:t xml:space="preserve">Nesse dia, o membro Enzo </w:t>
+      </w:r>
+      <w:proofErr w:type="spellStart"/>
+      <w:r>
+        <w:t>Spineli</w:t>
+      </w:r>
+      <w:proofErr w:type="spellEnd"/>
+      <w:r>
+        <w:t xml:space="preserve"> faltou em aula para realizar o levantamento de requisitos com sua tia.</w:t>
       </w:r>
     </w:p>
     <w:p>
@@ -4718,16 +4900,37 @@
       </w:pPr>
       <w:bookmarkStart w:id="26" w:name="_Toc228997833"/>
       <w:r>
-        <w:t>Reunião dia 23/03/2026 - Gerenciamento de projetos e quadros Kanban</w:t>
+        <w:t xml:space="preserve">Reunião dia 23/03/2026 - Gerenciamento de projetos e quadros </w:t>
+      </w:r>
+      <w:proofErr w:type="spellStart"/>
+      <w:r>
+        <w:t>Kanban</w:t>
       </w:r>
       <w:bookmarkEnd w:id="26"/>
+      <w:proofErr w:type="spellEnd"/>
     </w:p>
     <w:p>
       <w:pPr>
         <w:pStyle w:val="ParagrafoTCC2025"/>
       </w:pPr>
       <w:r>
-        <w:t>Na reunião de hoje foi escolhido o site Trello para Gerenciamento de projetos e quadros Kanban, sendo usado para maior organização e definição de objetivos</w:t>
+        <w:t xml:space="preserve">Na reunião de hoje foi escolhido o site </w:t>
+      </w:r>
+      <w:proofErr w:type="spellStart"/>
+      <w:r>
+        <w:t>Trello</w:t>
+      </w:r>
+      <w:proofErr w:type="spellEnd"/>
+      <w:r>
+        <w:t xml:space="preserve"> para Gerenciamento de projetos e quadros </w:t>
+      </w:r>
+      <w:proofErr w:type="spellStart"/>
+      <w:r>
+        <w:t>Kanban</w:t>
+      </w:r>
+      <w:proofErr w:type="spellEnd"/>
+      <w:r>
+        <w:t>, sendo usado para maior organização e definição de objetivos</w:t>
       </w:r>
     </w:p>
     <w:p>
@@ -4767,8 +4970,13 @@
         <w:t>andamento d</w:t>
       </w:r>
       <w:r>
-        <w:t>os projetos em classe do Figma</w:t>
-      </w:r>
+        <w:t xml:space="preserve">os projetos em classe do </w:t>
+      </w:r>
+      <w:proofErr w:type="spellStart"/>
+      <w:r>
+        <w:t>Figma</w:t>
+      </w:r>
+      <w:proofErr w:type="spellEnd"/>
       <w:r>
         <w:t>.</w:t>
       </w:r>
@@ -4848,7 +5056,15 @@
         <w:t xml:space="preserve">Neste dia foi </w:t>
       </w:r>
       <w:r>
-        <w:t>finalizada todas as formatações de documento geral para Documentação e Diario de Bordo pelo Professor Emerson Rodrigues.</w:t>
+        <w:t xml:space="preserve">finalizada todas as formatações de documento geral para Documentação e </w:t>
+      </w:r>
+      <w:proofErr w:type="spellStart"/>
+      <w:r>
+        <w:t>Diario</w:t>
+      </w:r>
+      <w:proofErr w:type="spellEnd"/>
+      <w:r>
+        <w:t xml:space="preserve"> de Bordo pelo Professor Emerson Rodrigues.</w:t>
       </w:r>
     </w:p>
     <w:p>
@@ -4866,7 +5082,39 @@
         <w:pStyle w:val="ParagrafoTCC2025"/>
       </w:pPr>
       <w:r>
-        <w:t>Neste dia foi feito as configurações e upagem de arquivos para o Repositório do Github, alinhamento do Trello e concensso geral do projeto.</w:t>
+        <w:t xml:space="preserve">Neste dia foi feito as configurações e </w:t>
+      </w:r>
+      <w:proofErr w:type="spellStart"/>
+      <w:r>
+        <w:t>upagem</w:t>
+      </w:r>
+      <w:proofErr w:type="spellEnd"/>
+      <w:r>
+        <w:t xml:space="preserve"> de arquivos para o Repositório do </w:t>
+      </w:r>
+      <w:proofErr w:type="spellStart"/>
+      <w:r>
+        <w:t>Github</w:t>
+      </w:r>
+      <w:proofErr w:type="spellEnd"/>
+      <w:r>
+        <w:t xml:space="preserve">, alinhamento do </w:t>
+      </w:r>
+      <w:proofErr w:type="spellStart"/>
+      <w:r>
+        <w:t>Trello</w:t>
+      </w:r>
+      <w:proofErr w:type="spellEnd"/>
+      <w:r>
+        <w:t xml:space="preserve"> e </w:t>
+      </w:r>
+      <w:proofErr w:type="spellStart"/>
+      <w:r>
+        <w:t>concensso</w:t>
+      </w:r>
+      <w:proofErr w:type="spellEnd"/>
+      <w:r>
+        <w:t xml:space="preserve"> geral do projeto.</w:t>
       </w:r>
     </w:p>
     <w:p>
@@ -5202,7 +5450,7 @@
     </w:p>
     <w:p>
       <w:pPr>
-        <w:pStyle w:val="Legenda"/>
+        <w:pStyle w:val="FonteTCC2025"/>
       </w:pPr>
       <w:r>
         <w:t>Fonte: Feito por Os Autores</w:t>
@@ -5232,7 +5480,15 @@
         <w:t xml:space="preserve"> gerais e quadros</w:t>
       </w:r>
       <w:r>
-        <w:t xml:space="preserve"> da Documentação do Software, foi realizado o conferimento de requisitos do Software com o BD para planejamento final do BD.</w:t>
+        <w:t xml:space="preserve"> da Documentação do Software, foi realizado o </w:t>
+      </w:r>
+      <w:proofErr w:type="spellStart"/>
+      <w:r>
+        <w:t>conferimento</w:t>
+      </w:r>
+      <w:proofErr w:type="spellEnd"/>
+      <w:r>
+        <w:t xml:space="preserve"> de requisitos do Software com o BD para planejamento final do BD.</w:t>
       </w:r>
     </w:p>
     <w:p>
@@ -5259,9 +5515,6 @@
         <w:t>8</w:t>
       </w:r>
       <w:r>
-        <w:rPr>
-          <w:noProof/>
-        </w:rPr>
         <w:fldChar w:fldCharType="end"/>
       </w:r>
       <w:r>
@@ -5313,10 +5566,15 @@
     </w:p>
     <w:p>
       <w:pPr>
-        <w:pStyle w:val="Legenda"/>
-      </w:pPr>
-      <w:r>
-        <w:t>Fonte:Feito por Os Autores</w:t>
+        <w:pStyle w:val="FonteTCC2025"/>
+      </w:pPr>
+      <w:proofErr w:type="spellStart"/>
+      <w:r>
+        <w:t>Fonte:Feito</w:t>
+      </w:r>
+      <w:proofErr w:type="spellEnd"/>
+      <w:r>
+        <w:t xml:space="preserve"> por Os Autores</w:t>
       </w:r>
     </w:p>
     <w:p/>
@@ -5326,6 +5584,7 @@
       </w:pPr>
       <w:bookmarkStart w:id="41" w:name="_Toc228997844"/>
       <w:r>
+        <w:lastRenderedPageBreak/>
         <w:t xml:space="preserve">Mudanças Dia 24/04/2026 – </w:t>
       </w:r>
       <w:r>
@@ -5352,7 +5611,7 @@
     </w:p>
     <w:p>
       <w:pPr>
-        <w:pStyle w:val="Legenda"/>
+        <w:pStyle w:val="FiguraTCC"/>
         <w:rPr>
           <w:rStyle w:val="FiguraTCCChar"/>
         </w:rPr>
@@ -5456,7 +5715,7 @@
     </w:p>
     <w:p>
       <w:pPr>
-        <w:pStyle w:val="Legenda"/>
+        <w:pStyle w:val="FonteTCC2025"/>
       </w:pPr>
       <w:r>
         <w:t>Fonte: Feito por Os Autores</w:t>
@@ -5492,7 +5751,6 @@
         <w:rPr>
           <w:rStyle w:val="FiguraTCCChar"/>
         </w:rPr>
-        <w:lastRenderedPageBreak/>
         <w:t xml:space="preserve">Figura </w:t>
       </w:r>
       <w:r>
@@ -5596,6 +5854,7 @@
       </w:pPr>
       <w:bookmarkStart w:id="45" w:name="_Toc228997846"/>
       <w:r>
+        <w:lastRenderedPageBreak/>
         <w:t>Aula dia 01/05/2026 –</w:t>
       </w:r>
       <w:bookmarkEnd w:id="45"/>
@@ -5659,9 +5918,14 @@
         <w:fldChar w:fldCharType="end"/>
       </w:r>
       <w:r>
-        <w:t xml:space="preserve"> - Print do Aplicativo de Comunicação Discord</w:t>
+        <w:t xml:space="preserve"> - Print do Aplicativo de Comunicação </w:t>
+      </w:r>
+      <w:proofErr w:type="spellStart"/>
+      <w:r>
+        <w:t>Discord</w:t>
       </w:r>
       <w:bookmarkEnd w:id="47"/>
+      <w:proofErr w:type="spellEnd"/>
     </w:p>
     <w:p>
       <w:pPr>
@@ -5710,8 +5974,13 @@
         <w:pStyle w:val="FonteTCC2025"/>
       </w:pPr>
       <w:r>
-        <w:t>Fonte: Aplicativo Discord</w:t>
-      </w:r>
+        <w:t xml:space="preserve">Fonte: Aplicativo </w:t>
+      </w:r>
+      <w:proofErr w:type="spellStart"/>
+      <w:r>
+        <w:t>Discord</w:t>
+      </w:r>
+      <w:proofErr w:type="spellEnd"/>
     </w:p>
     <w:p>
       <w:pPr>
@@ -5722,8 +5991,17 @@
           <w:color w:val="FF0000"/>
           <w:highlight w:val="yellow"/>
         </w:rPr>
-        <w:t>Faltou texto pós img</w:t>
-      </w:r>
+        <w:t xml:space="preserve">Faltou texto pós </w:t>
+      </w:r>
+      <w:proofErr w:type="spellStart"/>
+      <w:r>
+        <w:rPr>
+          <w:color w:val="FF0000"/>
+          <w:highlight w:val="yellow"/>
+        </w:rPr>
+        <w:t>img</w:t>
+      </w:r>
+      <w:proofErr w:type="spellEnd"/>
     </w:p>
     <w:p>
       <w:pPr>
@@ -5734,7 +6012,23 @@
         <w:t xml:space="preserve">Atualizações dia 05/05/2026 – </w:t>
       </w:r>
       <w:r>
-        <w:t>Criação das models, migrations e controllers para ramos, seguradoras e parcelas.</w:t>
+        <w:t xml:space="preserve">Criação das models, </w:t>
+      </w:r>
+      <w:proofErr w:type="spellStart"/>
+      <w:r>
+        <w:t>migrations</w:t>
+      </w:r>
+      <w:proofErr w:type="spellEnd"/>
+      <w:r>
+        <w:t xml:space="preserve"> e </w:t>
+      </w:r>
+      <w:proofErr w:type="spellStart"/>
+      <w:r>
+        <w:t>controllers</w:t>
+      </w:r>
+      <w:proofErr w:type="spellEnd"/>
+      <w:r>
+        <w:t xml:space="preserve"> para ramos, seguradoras e parcelas.</w:t>
       </w:r>
       <w:bookmarkEnd w:id="48"/>
     </w:p>
@@ -5743,7 +6037,23 @@
         <w:pStyle w:val="ParagrafoTCC2025"/>
       </w:pPr>
       <w:r>
-        <w:t>Neste dia foram feitas as criações das models, migrations e controllers para as tabelas ramos, seguradoras e parcelas.</w:t>
+        <w:t xml:space="preserve">Neste dia foram feitas as criações das models, </w:t>
+      </w:r>
+      <w:proofErr w:type="spellStart"/>
+      <w:r>
+        <w:t>migrations</w:t>
+      </w:r>
+      <w:proofErr w:type="spellEnd"/>
+      <w:r>
+        <w:t xml:space="preserve"> e </w:t>
+      </w:r>
+      <w:proofErr w:type="spellStart"/>
+      <w:r>
+        <w:t>controllers</w:t>
+      </w:r>
+      <w:proofErr w:type="spellEnd"/>
+      <w:r>
+        <w:t xml:space="preserve"> para as tabelas ramos, seguradoras e parcelas.</w:t>
       </w:r>
     </w:p>
     <w:p>
@@ -5755,7 +6065,6 @@
         <w:rPr>
           <w:rStyle w:val="FiguraTCCChar"/>
         </w:rPr>
-        <w:lastRenderedPageBreak/>
         <w:t xml:space="preserve">Figura </w:t>
       </w:r>
       <w:r>
@@ -5838,7 +6147,10 @@
         <w:pStyle w:val="FonteTCC2025"/>
       </w:pPr>
       <w:r>
-        <w:t>Fonte: Feito por Os Autores</w:t>
+        <w:t xml:space="preserve">Fonte: </w:t>
+      </w:r>
+      <w:r>
+        <w:t>Print do arquivo GitHub</w:t>
       </w:r>
     </w:p>
     <w:p>
@@ -5856,7 +6168,23 @@
         <w:pStyle w:val="ParagrafoTCC2025"/>
       </w:pPr>
       <w:r>
-        <w:t>Neste dia foi realizado a vistoria e verificação do funcionamento e andamento dos projetos de Front-End e Back-End dos Softwares.</w:t>
+        <w:t>Neste dia foi realizado a vistoria e verificação do funcionamento e andamento dos projetos de Front-</w:t>
+      </w:r>
+      <w:proofErr w:type="spellStart"/>
+      <w:r>
+        <w:t>End</w:t>
+      </w:r>
+      <w:proofErr w:type="spellEnd"/>
+      <w:r>
+        <w:t xml:space="preserve"> e Back-</w:t>
+      </w:r>
+      <w:proofErr w:type="spellStart"/>
+      <w:r>
+        <w:t>End</w:t>
+      </w:r>
+      <w:proofErr w:type="spellEnd"/>
+      <w:r>
+        <w:t xml:space="preserve"> dos Softwares.</w:t>
       </w:r>
     </w:p>
     <w:p>
@@ -5864,6 +6192,7 @@
         <w:pStyle w:val="Ttulo1"/>
       </w:pPr>
       <w:r>
+        <w:lastRenderedPageBreak/>
         <w:t xml:space="preserve">Aula dia 08/05/2026 – </w:t>
       </w:r>
       <w:r>
@@ -5886,16 +6215,140 @@
         <w:pStyle w:val="Ttulo1"/>
       </w:pPr>
       <w:r>
-        <w:t>Reunião</w:t>
-      </w:r>
-      <w:r>
-        <w:t xml:space="preserve"> dia </w:t>
-      </w:r>
-      <w:r>
-        <w:t>12</w:t>
-      </w:r>
-      <w:r>
-        <w:t>/05/2026</w:t>
+        <w:t>Mudanças</w:t>
+      </w:r>
+      <w:r>
+        <w:t xml:space="preserve"> dia 1</w:t>
+      </w:r>
+      <w:r>
+        <w:t>1</w:t>
+      </w:r>
+      <w:r>
+        <w:t xml:space="preserve">/05/2026 – </w:t>
+      </w:r>
+      <w:r>
+        <w:t xml:space="preserve">Alteração das </w:t>
+      </w:r>
+      <w:proofErr w:type="spellStart"/>
+      <w:r>
+        <w:t>Migrations</w:t>
+      </w:r>
+      <w:proofErr w:type="spellEnd"/>
+      <w:r>
+        <w:t xml:space="preserve"> e correção das mesmas</w:t>
+      </w:r>
+    </w:p>
+    <w:p>
+      <w:r>
+        <w:t xml:space="preserve">Neste dia foram realizadas alterações nas </w:t>
+      </w:r>
+      <w:proofErr w:type="spellStart"/>
+      <w:r>
+        <w:t>Migrations</w:t>
+      </w:r>
+      <w:proofErr w:type="spellEnd"/>
+      <w:r>
+        <w:t xml:space="preserve"> do BD para deixar em conformidade </w:t>
+      </w:r>
+      <w:r>
+        <w:t xml:space="preserve">com informações e tabelas do mesmo e preparar para upar no </w:t>
+      </w:r>
+      <w:proofErr w:type="spellStart"/>
+      <w:r>
+        <w:t>SupaBase</w:t>
+      </w:r>
+      <w:proofErr w:type="spellEnd"/>
+      <w:r>
+        <w:t>.</w:t>
+      </w:r>
+    </w:p>
+    <w:p>
+      <w:pPr>
+        <w:pStyle w:val="FiguraTCC"/>
+      </w:pPr>
+      <w:r>
+        <w:t xml:space="preserve">Figura </w:t>
+      </w:r>
+      <w:fldSimple w:instr=" SEQ Figura \* ARABIC ">
+        <w:r>
+          <w:rPr>
+            <w:noProof/>
+          </w:rPr>
+          <w:t>13</w:t>
+        </w:r>
+      </w:fldSimple>
+      <w:r>
+        <w:t xml:space="preserve"> - Alteração </w:t>
+      </w:r>
+      <w:proofErr w:type="spellStart"/>
+      <w:r>
+        <w:t>Migrations</w:t>
+      </w:r>
+      <w:proofErr w:type="spellEnd"/>
+      <w:r>
+        <w:t xml:space="preserve"> e correções</w:t>
+      </w:r>
+    </w:p>
+    <w:p>
+      <w:pPr>
+        <w:pStyle w:val="ImagemTCC2026"/>
+        <w:keepNext/>
+      </w:pPr>
+      <w:r>
+        <w:drawing>
+          <wp:inline distT="0" distB="0" distL="0" distR="0" wp14:anchorId="12A2C7C6" wp14:editId="495E5A3B">
+            <wp:extent cx="5836285" cy="2783205"/>
+            <wp:effectExtent l="0" t="0" r="0" b="0"/>
+            <wp:docPr id="13" name="Imagem 13"/>
+            <wp:cNvGraphicFramePr>
+              <a:graphicFrameLocks xmlns:a="http://schemas.openxmlformats.org/drawingml/2006/main" noChangeAspect="1"/>
+            </wp:cNvGraphicFramePr>
+            <a:graphic xmlns:a="http://schemas.openxmlformats.org/drawingml/2006/main">
+              <a:graphicData uri="http://schemas.openxmlformats.org/drawingml/2006/picture">
+                <pic:pic xmlns:pic="http://schemas.openxmlformats.org/drawingml/2006/picture">
+                  <pic:nvPicPr>
+                    <pic:cNvPr id="1" name=""/>
+                    <pic:cNvPicPr/>
+                  </pic:nvPicPr>
+                  <pic:blipFill>
+                    <a:blip r:embed="rId23"/>
+                    <a:stretch>
+                      <a:fillRect/>
+                    </a:stretch>
+                  </pic:blipFill>
+                  <pic:spPr>
+                    <a:xfrm>
+                      <a:off x="0" y="0"/>
+                      <a:ext cx="5836285" cy="2783205"/>
+                    </a:xfrm>
+                    <a:prstGeom prst="rect">
+                      <a:avLst/>
+                    </a:prstGeom>
+                  </pic:spPr>
+                </pic:pic>
+              </a:graphicData>
+            </a:graphic>
+          </wp:inline>
+        </w:drawing>
+      </w:r>
+    </w:p>
+    <w:p>
+      <w:pPr>
+        <w:pStyle w:val="FonteTCC2025"/>
+      </w:pPr>
+      <w:r>
+        <w:t xml:space="preserve">Fonte: </w:t>
+      </w:r>
+      <w:r>
+        <w:t>Print do Aplicativo GitHub</w:t>
+      </w:r>
+    </w:p>
+    <w:p>
+      <w:pPr>
+        <w:pStyle w:val="Ttulo1"/>
+      </w:pPr>
+      <w:r>
+        <w:t>Reunião dia 12/05/2026</w:t>
       </w:r>
       <w:r>
         <w:t xml:space="preserve"> – Hospedagem do BD e verificação de andamento</w:t>
@@ -5914,30 +6367,24 @@
         <w:pStyle w:val="FiguraTCC"/>
       </w:pPr>
       <w:r>
-        <w:lastRenderedPageBreak/>
         <w:t xml:space="preserve">Figura </w:t>
       </w:r>
-      <w:r>
-        <w:fldChar w:fldCharType="begin"/>
-      </w:r>
-      <w:r>
-        <w:instrText xml:space="preserve"> SEQ Figura \* ARABIC </w:instrText>
-      </w:r>
-      <w:r>
-        <w:fldChar w:fldCharType="separate"/>
-      </w:r>
-      <w:r>
-        <w:rPr>
-          <w:noProof/>
-        </w:rPr>
-        <w:t>13</w:t>
-      </w:r>
-      <w:r>
-        <w:fldChar w:fldCharType="end"/>
-      </w:r>
-      <w:r>
-        <w:t xml:space="preserve"> - Print site BD Supabase</w:t>
-      </w:r>
+      <w:fldSimple w:instr=" SEQ Figura \* ARABIC ">
+        <w:r>
+          <w:rPr>
+            <w:noProof/>
+          </w:rPr>
+          <w:t>14</w:t>
+        </w:r>
+      </w:fldSimple>
+      <w:r>
+        <w:t xml:space="preserve"> - Print site BD </w:t>
+      </w:r>
+      <w:proofErr w:type="spellStart"/>
+      <w:r>
+        <w:t>Supabase</w:t>
+      </w:r>
+      <w:proofErr w:type="spellEnd"/>
     </w:p>
     <w:p>
       <w:pPr>
@@ -5961,7 +6408,7 @@
                     <pic:cNvPicPr/>
                   </pic:nvPicPr>
                   <pic:blipFill>
-                    <a:blip r:embed="rId23" cstate="print">
+                    <a:blip r:embed="rId24" cstate="print">
                       <a:extLst>
                         <a:ext uri="{28A0092B-C50C-407E-A947-70E740481C1C}">
                           <a14:useLocalDpi xmlns:a14="http://schemas.microsoft.com/office/drawing/2010/main" val="0"/>
@@ -5993,9 +6440,771 @@
         <w:pStyle w:val="FonteTCC2025"/>
       </w:pPr>
       <w:r>
-        <w:t>Fonte: Feito por Os Autores</w:t>
-      </w:r>
-    </w:p>
+        <w:t xml:space="preserve">Fonte: </w:t>
+      </w:r>
+      <w:r>
+        <w:t xml:space="preserve">Print do Site </w:t>
+      </w:r>
+      <w:proofErr w:type="spellStart"/>
+      <w:r>
+        <w:t>SupaBase</w:t>
+      </w:r>
+      <w:proofErr w:type="spellEnd"/>
+      <w:r>
+        <w:t xml:space="preserve"> e </w:t>
+      </w:r>
+      <w:proofErr w:type="spellStart"/>
+      <w:r>
+        <w:t>Discord</w:t>
+      </w:r>
+      <w:proofErr w:type="spellEnd"/>
+    </w:p>
+    <w:p>
+      <w:pPr>
+        <w:pStyle w:val="Ttulo1"/>
+      </w:pPr>
+      <w:r>
+        <w:lastRenderedPageBreak/>
+        <w:t>Mudanças</w:t>
+      </w:r>
+      <w:r>
+        <w:t xml:space="preserve"> dia 12/05/2026 – </w:t>
+      </w:r>
+      <w:r>
+        <w:t xml:space="preserve">Correção de Models, Instalação de Pacotes e conexão do banco com </w:t>
+      </w:r>
+      <w:proofErr w:type="spellStart"/>
+      <w:r>
+        <w:t>SupaBase</w:t>
+      </w:r>
+      <w:proofErr w:type="spellEnd"/>
+    </w:p>
+    <w:p>
+      <w:pPr>
+        <w:pStyle w:val="ParagrafoTCC2025"/>
+      </w:pPr>
+      <w:r>
+        <w:t xml:space="preserve">Foram realizadas correções nos models do sistema, além da instalação de pacotes necessários para o desenvolvimento da aplicação. Também foi feita a conexão do sistema com o </w:t>
+      </w:r>
+      <w:r>
+        <w:t xml:space="preserve">BD </w:t>
+      </w:r>
+      <w:r>
+        <w:t xml:space="preserve">PostgreSQL hospedado no </w:t>
+      </w:r>
+      <w:proofErr w:type="spellStart"/>
+      <w:r>
+        <w:t>Supabase</w:t>
+      </w:r>
+      <w:proofErr w:type="spellEnd"/>
+      <w:r>
+        <w:t>, garantindo o funcionamento da integração entre sistema e banco de dados.</w:t>
+      </w:r>
+    </w:p>
+    <w:p>
+      <w:pPr>
+        <w:pStyle w:val="FiguraTCC"/>
+      </w:pPr>
+      <w:r>
+        <w:t xml:space="preserve">Figura </w:t>
+      </w:r>
+      <w:fldSimple w:instr=" SEQ Figura \* ARABIC ">
+        <w:r>
+          <w:rPr>
+            <w:noProof/>
+          </w:rPr>
+          <w:t>15</w:t>
+        </w:r>
+      </w:fldSimple>
+      <w:r>
+        <w:t xml:space="preserve"> Correção de Models, instalação de pacotes e conexão com </w:t>
+      </w:r>
+      <w:proofErr w:type="spellStart"/>
+      <w:r>
+        <w:t>SupaBase</w:t>
+      </w:r>
+      <w:proofErr w:type="spellEnd"/>
+    </w:p>
+    <w:p>
+      <w:pPr>
+        <w:pStyle w:val="ImagemTCC2026"/>
+        <w:keepNext/>
+      </w:pPr>
+      <w:r>
+        <w:drawing>
+          <wp:inline distT="0" distB="0" distL="0" distR="0" wp14:anchorId="181C4203" wp14:editId="3CE3D228">
+            <wp:extent cx="5836285" cy="1381760"/>
+            <wp:effectExtent l="0" t="0" r="0" b="8890"/>
+            <wp:docPr id="15" name="Imagem 15"/>
+            <wp:cNvGraphicFramePr>
+              <a:graphicFrameLocks xmlns:a="http://schemas.openxmlformats.org/drawingml/2006/main" noChangeAspect="1"/>
+            </wp:cNvGraphicFramePr>
+            <a:graphic xmlns:a="http://schemas.openxmlformats.org/drawingml/2006/main">
+              <a:graphicData uri="http://schemas.openxmlformats.org/drawingml/2006/picture">
+                <pic:pic xmlns:pic="http://schemas.openxmlformats.org/drawingml/2006/picture">
+                  <pic:nvPicPr>
+                    <pic:cNvPr id="1" name=""/>
+                    <pic:cNvPicPr/>
+                  </pic:nvPicPr>
+                  <pic:blipFill>
+                    <a:blip r:embed="rId25"/>
+                    <a:stretch>
+                      <a:fillRect/>
+                    </a:stretch>
+                  </pic:blipFill>
+                  <pic:spPr>
+                    <a:xfrm>
+                      <a:off x="0" y="0"/>
+                      <a:ext cx="5836285" cy="1381760"/>
+                    </a:xfrm>
+                    <a:prstGeom prst="rect">
+                      <a:avLst/>
+                    </a:prstGeom>
+                  </pic:spPr>
+                </pic:pic>
+              </a:graphicData>
+            </a:graphic>
+          </wp:inline>
+        </w:drawing>
+      </w:r>
+    </w:p>
+    <w:p>
+      <w:pPr>
+        <w:pStyle w:val="FonteTCC2025"/>
+      </w:pPr>
+      <w:r>
+        <w:t>Fonte: Print do Aplicativo GitHub</w:t>
+      </w:r>
+    </w:p>
+    <w:p>
+      <w:pPr>
+        <w:pStyle w:val="Ttulo1"/>
+      </w:pPr>
+      <w:r>
+        <w:t>Mudanças</w:t>
+      </w:r>
+      <w:r>
+        <w:t xml:space="preserve"> dia 13/05/2026 – </w:t>
+      </w:r>
+      <w:r>
+        <w:t xml:space="preserve">Alteração do </w:t>
+      </w:r>
+      <w:proofErr w:type="spellStart"/>
+      <w:r>
+        <w:t>Controller</w:t>
+      </w:r>
+      <w:proofErr w:type="spellEnd"/>
+    </w:p>
+    <w:p>
+      <w:pPr>
+        <w:pStyle w:val="ParagrafoTCC2025"/>
+      </w:pPr>
+      <w:r>
+        <w:t xml:space="preserve">Foram realizadas alterações nos </w:t>
+      </w:r>
+      <w:proofErr w:type="spellStart"/>
+      <w:r>
+        <w:t>controllers</w:t>
+      </w:r>
+      <w:proofErr w:type="spellEnd"/>
+      <w:r>
+        <w:t xml:space="preserve"> do sistema com o objetivo de corrigir funcionalidades e melhorar o processamento das requisições entre a interface e o banco de dados, garantindo maior organização e funcionamento da aplicação.</w:t>
+      </w:r>
+    </w:p>
+    <w:p>
+      <w:pPr>
+        <w:pStyle w:val="FiguraTCC"/>
+      </w:pPr>
+      <w:r>
+        <w:t xml:space="preserve">Figura </w:t>
+      </w:r>
+      <w:fldSimple w:instr=" SEQ Figura \* ARABIC ">
+        <w:r>
+          <w:rPr>
+            <w:noProof/>
+          </w:rPr>
+          <w:t>16</w:t>
+        </w:r>
+      </w:fldSimple>
+      <w:r>
+        <w:t xml:space="preserve"> - Alteração do </w:t>
+      </w:r>
+      <w:proofErr w:type="spellStart"/>
+      <w:r>
+        <w:t>Controller</w:t>
+      </w:r>
+      <w:proofErr w:type="spellEnd"/>
+      <w:r>
+        <w:t xml:space="preserve"> para salvar clientes</w:t>
+      </w:r>
+    </w:p>
+    <w:p>
+      <w:pPr>
+        <w:pStyle w:val="FonteTCC2025"/>
+        <w:keepNext/>
+      </w:pPr>
+      <w:r>
+        <w:drawing>
+          <wp:inline distT="0" distB="0" distL="0" distR="0" wp14:anchorId="0FF36739" wp14:editId="0A21059D">
+            <wp:extent cx="5836285" cy="789940"/>
+            <wp:effectExtent l="0" t="0" r="0" b="0"/>
+            <wp:docPr id="16" name="Imagem 16"/>
+            <wp:cNvGraphicFramePr>
+              <a:graphicFrameLocks xmlns:a="http://schemas.openxmlformats.org/drawingml/2006/main" noChangeAspect="1"/>
+            </wp:cNvGraphicFramePr>
+            <a:graphic xmlns:a="http://schemas.openxmlformats.org/drawingml/2006/main">
+              <a:graphicData uri="http://schemas.openxmlformats.org/drawingml/2006/picture">
+                <pic:pic xmlns:pic="http://schemas.openxmlformats.org/drawingml/2006/picture">
+                  <pic:nvPicPr>
+                    <pic:cNvPr id="1" name=""/>
+                    <pic:cNvPicPr/>
+                  </pic:nvPicPr>
+                  <pic:blipFill>
+                    <a:blip r:embed="rId26"/>
+                    <a:stretch>
+                      <a:fillRect/>
+                    </a:stretch>
+                  </pic:blipFill>
+                  <pic:spPr>
+                    <a:xfrm>
+                      <a:off x="0" y="0"/>
+                      <a:ext cx="5836285" cy="789940"/>
+                    </a:xfrm>
+                    <a:prstGeom prst="rect">
+                      <a:avLst/>
+                    </a:prstGeom>
+                  </pic:spPr>
+                </pic:pic>
+              </a:graphicData>
+            </a:graphic>
+          </wp:inline>
+        </w:drawing>
+      </w:r>
+    </w:p>
+    <w:p>
+      <w:pPr>
+        <w:pStyle w:val="FonteTCC2025"/>
+      </w:pPr>
+      <w:r>
+        <w:t>Fonte: Print do aplicativo GitHub</w:t>
+      </w:r>
+    </w:p>
+    <w:p>
+      <w:pPr>
+        <w:pStyle w:val="Ttulo1"/>
+      </w:pPr>
+      <w:r>
+        <w:t>Aula</w:t>
+      </w:r>
+      <w:r>
+        <w:t xml:space="preserve"> dia 1</w:t>
+      </w:r>
+      <w:r>
+        <w:t>3</w:t>
+      </w:r>
+      <w:r>
+        <w:t xml:space="preserve">/05/2026 – </w:t>
+      </w:r>
+      <w:r>
+        <w:t>Cinema</w:t>
+      </w:r>
+    </w:p>
+    <w:p>
+      <w:pPr>
+        <w:pStyle w:val="ParagrafoTCC2025"/>
+      </w:pPr>
+      <w:r>
+        <w:t>Neste dia não houve aula devido ao evento onde os alunos do curso de DS foram ao cinema após o horário do intervalo</w:t>
+      </w:r>
+      <w:r>
+        <w:t>.</w:t>
+      </w:r>
+    </w:p>
+    <w:p>
+      <w:pPr>
+        <w:pStyle w:val="Ttulo1"/>
+      </w:pPr>
+      <w:r>
+        <w:t>Mudanças dia 1</w:t>
+      </w:r>
+      <w:r>
+        <w:t>4</w:t>
+      </w:r>
+      <w:r>
+        <w:t xml:space="preserve">/05/2026 – </w:t>
+      </w:r>
+      <w:r>
+        <w:t>Criação do código para salvar segurado e consumo API</w:t>
+      </w:r>
+    </w:p>
+    <w:p>
+      <w:pPr>
+        <w:pStyle w:val="ParagrafoTCC2025"/>
+      </w:pPr>
+      <w:r>
+        <w:t>Foi desenvolvido o código responsável pelo cadastro e salvamento de segurados no sistema. Também foi realizado o consumo de API para integração e comunicação entre o sistema e serviços externos, contribuindo para o funcionamento das funcionalidades da aplicação.</w:t>
+      </w:r>
+    </w:p>
+    <w:p>
+      <w:pPr>
+        <w:pStyle w:val="FiguraTCC"/>
+      </w:pPr>
+      <w:r>
+        <w:lastRenderedPageBreak/>
+        <w:t xml:space="preserve">Figura </w:t>
+      </w:r>
+      <w:fldSimple w:instr=" SEQ Figura \* ARABIC ">
+        <w:r>
+          <w:rPr>
+            <w:noProof/>
+          </w:rPr>
+          <w:t>17</w:t>
+        </w:r>
+      </w:fldSimple>
+      <w:r>
+        <w:t xml:space="preserve"> - Criação do código para salvar segurado e consumo API</w:t>
+      </w:r>
+    </w:p>
+    <w:p>
+      <w:pPr>
+        <w:pStyle w:val="ImagemTCC2026"/>
+        <w:keepNext/>
+      </w:pPr>
+      <w:r>
+        <w:drawing>
+          <wp:inline distT="0" distB="0" distL="0" distR="0" wp14:anchorId="199A75E1" wp14:editId="62C78311">
+            <wp:extent cx="5836285" cy="2806700"/>
+            <wp:effectExtent l="0" t="0" r="0" b="0"/>
+            <wp:docPr id="17" name="Imagem 17"/>
+            <wp:cNvGraphicFramePr>
+              <a:graphicFrameLocks xmlns:a="http://schemas.openxmlformats.org/drawingml/2006/main" noChangeAspect="1"/>
+            </wp:cNvGraphicFramePr>
+            <a:graphic xmlns:a="http://schemas.openxmlformats.org/drawingml/2006/main">
+              <a:graphicData uri="http://schemas.openxmlformats.org/drawingml/2006/picture">
+                <pic:pic xmlns:pic="http://schemas.openxmlformats.org/drawingml/2006/picture">
+                  <pic:nvPicPr>
+                    <pic:cNvPr id="0" name="Picture 1"/>
+                    <pic:cNvPicPr>
+                      <a:picLocks noChangeAspect="1" noChangeArrowheads="1"/>
+                    </pic:cNvPicPr>
+                  </pic:nvPicPr>
+                  <pic:blipFill>
+                    <a:blip r:embed="rId27" cstate="print">
+                      <a:extLst>
+                        <a:ext uri="{28A0092B-C50C-407E-A947-70E740481C1C}">
+                          <a14:useLocalDpi xmlns:a14="http://schemas.microsoft.com/office/drawing/2010/main" val="0"/>
+                        </a:ext>
+                      </a:extLst>
+                    </a:blip>
+                    <a:srcRect/>
+                    <a:stretch>
+                      <a:fillRect/>
+                    </a:stretch>
+                  </pic:blipFill>
+                  <pic:spPr bwMode="auto">
+                    <a:xfrm>
+                      <a:off x="0" y="0"/>
+                      <a:ext cx="5836285" cy="2806700"/>
+                    </a:xfrm>
+                    <a:prstGeom prst="rect">
+                      <a:avLst/>
+                    </a:prstGeom>
+                    <a:noFill/>
+                    <a:ln>
+                      <a:noFill/>
+                    </a:ln>
+                  </pic:spPr>
+                </pic:pic>
+              </a:graphicData>
+            </a:graphic>
+          </wp:inline>
+        </w:drawing>
+      </w:r>
+    </w:p>
+    <w:p>
+      <w:pPr>
+        <w:pStyle w:val="FonteTCC2025"/>
+      </w:pPr>
+      <w:r>
+        <w:t>Fonte: Print do Aplicativo GitHub</w:t>
+      </w:r>
+    </w:p>
+    <w:p>
+      <w:pPr>
+        <w:pStyle w:val="Ttulo1"/>
+      </w:pPr>
+      <w:r>
+        <w:t>Mudanç</w:t>
+      </w:r>
+      <w:r>
+        <w:t>a</w:t>
+      </w:r>
+      <w:r>
+        <w:t>s</w:t>
+      </w:r>
+      <w:r>
+        <w:t xml:space="preserve"> dia 15/05/2026 – </w:t>
+      </w:r>
+      <w:r>
+        <w:t xml:space="preserve">Correção do </w:t>
+      </w:r>
+      <w:proofErr w:type="spellStart"/>
+      <w:r>
+        <w:t>Import</w:t>
+      </w:r>
+      <w:proofErr w:type="spellEnd"/>
+      <w:r>
+        <w:t xml:space="preserve"> e </w:t>
+      </w:r>
+      <w:proofErr w:type="spellStart"/>
+      <w:r>
+        <w:t>Form</w:t>
+      </w:r>
+      <w:proofErr w:type="spellEnd"/>
+    </w:p>
+    <w:p>
+      <w:pPr>
+        <w:pStyle w:val="ParagrafoTCC2025"/>
+      </w:pPr>
+      <w:r>
+        <w:t xml:space="preserve">Foram realizadas correções nos </w:t>
+      </w:r>
+      <w:proofErr w:type="spellStart"/>
+      <w:r>
+        <w:t>imports</w:t>
+      </w:r>
+      <w:proofErr w:type="spellEnd"/>
+      <w:r>
+        <w:t xml:space="preserve"> e formulários do sistema, com o objetivo de organizar a estrutura do código e garantir o funcionamento correto das telas e funcionalidades da aplicação.</w:t>
+      </w:r>
+    </w:p>
+    <w:p>
+      <w:pPr>
+        <w:pStyle w:val="FiguraTCC"/>
+      </w:pPr>
+      <w:r>
+        <w:t xml:space="preserve">Figura </w:t>
+      </w:r>
+      <w:fldSimple w:instr=" SEQ Figura \* ARABIC ">
+        <w:r>
+          <w:rPr>
+            <w:noProof/>
+          </w:rPr>
+          <w:t>18</w:t>
+        </w:r>
+      </w:fldSimple>
+      <w:r>
+        <w:t xml:space="preserve"> - Correção do </w:t>
+      </w:r>
+      <w:proofErr w:type="spellStart"/>
+      <w:r>
+        <w:t>Import</w:t>
+      </w:r>
+      <w:proofErr w:type="spellEnd"/>
+      <w:r>
+        <w:t xml:space="preserve"> e </w:t>
+      </w:r>
+      <w:proofErr w:type="spellStart"/>
+      <w:r>
+        <w:t>Form</w:t>
+      </w:r>
+      <w:proofErr w:type="spellEnd"/>
+    </w:p>
+    <w:p>
+      <w:pPr>
+        <w:pStyle w:val="ImagemTCC2026"/>
+        <w:keepNext/>
+      </w:pPr>
+      <w:r>
+        <w:drawing>
+          <wp:inline distT="0" distB="0" distL="0" distR="0" wp14:anchorId="6E1FBE1F" wp14:editId="5118FA2B">
+            <wp:extent cx="5828030" cy="2830830"/>
+            <wp:effectExtent l="0" t="0" r="1270" b="7620"/>
+            <wp:docPr id="18" name="Imagem 18"/>
+            <wp:cNvGraphicFramePr>
+              <a:graphicFrameLocks xmlns:a="http://schemas.openxmlformats.org/drawingml/2006/main" noChangeAspect="1"/>
+            </wp:cNvGraphicFramePr>
+            <a:graphic xmlns:a="http://schemas.openxmlformats.org/drawingml/2006/main">
+              <a:graphicData uri="http://schemas.openxmlformats.org/drawingml/2006/picture">
+                <pic:pic xmlns:pic="http://schemas.openxmlformats.org/drawingml/2006/picture">
+                  <pic:nvPicPr>
+                    <pic:cNvPr id="0" name="Picture 2"/>
+                    <pic:cNvPicPr>
+                      <a:picLocks noChangeAspect="1" noChangeArrowheads="1"/>
+                    </pic:cNvPicPr>
+                  </pic:nvPicPr>
+                  <pic:blipFill>
+                    <a:blip r:embed="rId28" cstate="print">
+                      <a:extLst>
+                        <a:ext uri="{28A0092B-C50C-407E-A947-70E740481C1C}">
+                          <a14:useLocalDpi xmlns:a14="http://schemas.microsoft.com/office/drawing/2010/main" val="0"/>
+                        </a:ext>
+                      </a:extLst>
+                    </a:blip>
+                    <a:srcRect/>
+                    <a:stretch>
+                      <a:fillRect/>
+                    </a:stretch>
+                  </pic:blipFill>
+                  <pic:spPr bwMode="auto">
+                    <a:xfrm>
+                      <a:off x="0" y="0"/>
+                      <a:ext cx="5828030" cy="2830830"/>
+                    </a:xfrm>
+                    <a:prstGeom prst="rect">
+                      <a:avLst/>
+                    </a:prstGeom>
+                    <a:noFill/>
+                    <a:ln>
+                      <a:noFill/>
+                    </a:ln>
+                  </pic:spPr>
+                </pic:pic>
+              </a:graphicData>
+            </a:graphic>
+          </wp:inline>
+        </w:drawing>
+      </w:r>
+    </w:p>
+    <w:p>
+      <w:pPr>
+        <w:pStyle w:val="FonteTCC2025"/>
+      </w:pPr>
+      <w:r>
+        <w:t>Fonte  - Print do Aplicativo GitHub</w:t>
+      </w:r>
+    </w:p>
+    <w:p>
+      <w:pPr>
+        <w:pStyle w:val="Ttulo1"/>
+      </w:pPr>
+      <w:r>
+        <w:t>Aula dia 1</w:t>
+      </w:r>
+      <w:r>
+        <w:t>5</w:t>
+      </w:r>
+      <w:r>
+        <w:t xml:space="preserve">/05/2026 – </w:t>
+      </w:r>
+      <w:r>
+        <w:t>Sem avanços</w:t>
+      </w:r>
+    </w:p>
+    <w:p>
+      <w:pPr>
+        <w:pStyle w:val="ParagrafoTCC2025"/>
+      </w:pPr>
+      <w:r>
+        <w:t>Nesta aula não foram feitas avanços e nem verificações por conta do celular do professor Emerson Rodrigues ter quebrado e não conseguir ter acesso ao Email com as planilhas de atividade</w:t>
+      </w:r>
+    </w:p>
+    <w:p>
+      <w:pPr>
+        <w:pStyle w:val="Ttulo1"/>
+      </w:pPr>
+      <w:r>
+        <w:lastRenderedPageBreak/>
+        <w:t xml:space="preserve">Mudanças </w:t>
+      </w:r>
+      <w:r>
+        <w:t>dia 1</w:t>
+      </w:r>
+      <w:r>
+        <w:t>6</w:t>
+      </w:r>
+      <w:r>
+        <w:t xml:space="preserve">/05/2026 – </w:t>
+      </w:r>
+      <w:r>
+        <w:t>Update Cobranças e Pagamentos</w:t>
+      </w:r>
+    </w:p>
+    <w:p>
+      <w:pPr>
+        <w:pStyle w:val="ParagrafoTCC2025"/>
+      </w:pPr>
+      <w:r>
+        <w:t>Foram realizadas atualizações nos módulos de cobranças e pagamentos do sistema, com o objetivo de melhorar o controle financeiro, organização das informações e funcionamento das funcionalidades relacionadas às parcelas e registros de pagamento.</w:t>
+      </w:r>
+    </w:p>
+    <w:p>
+      <w:pPr>
+        <w:pStyle w:val="FiguraTCC"/>
+      </w:pPr>
+      <w:r>
+        <w:t xml:space="preserve">Figura </w:t>
+      </w:r>
+      <w:fldSimple w:instr=" SEQ Figura \* ARABIC ">
+        <w:r>
+          <w:rPr>
+            <w:noProof/>
+          </w:rPr>
+          <w:t>19</w:t>
+        </w:r>
+      </w:fldSimple>
+      <w:r>
+        <w:t xml:space="preserve"> - Update Cobranças e Pagamentos</w:t>
+      </w:r>
+    </w:p>
+    <w:p>
+      <w:pPr>
+        <w:pStyle w:val="ImagemTCC2026"/>
+        <w:keepNext/>
+      </w:pPr>
+      <w:r>
+        <w:drawing>
+          <wp:inline distT="0" distB="0" distL="0" distR="0" wp14:anchorId="34FD0A44" wp14:editId="0F3FB648">
+            <wp:extent cx="5836285" cy="1139190"/>
+            <wp:effectExtent l="0" t="0" r="0" b="3810"/>
+            <wp:docPr id="19" name="Imagem 19"/>
+            <wp:cNvGraphicFramePr>
+              <a:graphicFrameLocks xmlns:a="http://schemas.openxmlformats.org/drawingml/2006/main" noChangeAspect="1"/>
+            </wp:cNvGraphicFramePr>
+            <a:graphic xmlns:a="http://schemas.openxmlformats.org/drawingml/2006/main">
+              <a:graphicData uri="http://schemas.openxmlformats.org/drawingml/2006/picture">
+                <pic:pic xmlns:pic="http://schemas.openxmlformats.org/drawingml/2006/picture">
+                  <pic:nvPicPr>
+                    <pic:cNvPr id="1" name=""/>
+                    <pic:cNvPicPr/>
+                  </pic:nvPicPr>
+                  <pic:blipFill>
+                    <a:blip r:embed="rId29"/>
+                    <a:stretch>
+                      <a:fillRect/>
+                    </a:stretch>
+                  </pic:blipFill>
+                  <pic:spPr>
+                    <a:xfrm>
+                      <a:off x="0" y="0"/>
+                      <a:ext cx="5836285" cy="1139190"/>
+                    </a:xfrm>
+                    <a:prstGeom prst="rect">
+                      <a:avLst/>
+                    </a:prstGeom>
+                  </pic:spPr>
+                </pic:pic>
+              </a:graphicData>
+            </a:graphic>
+          </wp:inline>
+        </w:drawing>
+      </w:r>
+    </w:p>
+    <w:p>
+      <w:pPr>
+        <w:pStyle w:val="FonteTCC2025"/>
+      </w:pPr>
+      <w:r>
+        <w:t>Fonte: Print Aplicativo do Github</w:t>
+      </w:r>
+    </w:p>
+    <w:p>
+      <w:pPr>
+        <w:pStyle w:val="Ttulo1"/>
+      </w:pPr>
+      <w:r>
+        <w:t>Mudanças dia 1</w:t>
+      </w:r>
+      <w:r>
+        <w:t>8</w:t>
+      </w:r>
+      <w:r>
+        <w:t xml:space="preserve">/05/2026 – </w:t>
+      </w:r>
+      <w:r>
+        <w:t xml:space="preserve">Apólices CRUD, Correção versão PHP e Correção dos nomes dos </w:t>
+      </w:r>
+      <w:proofErr w:type="spellStart"/>
+      <w:r>
+        <w:t>Controllers</w:t>
+      </w:r>
+      <w:proofErr w:type="spellEnd"/>
+      <w:r>
+        <w:t>.</w:t>
+      </w:r>
+    </w:p>
+    <w:p>
+      <w:pPr>
+        <w:pStyle w:val="FiguraTCC"/>
+      </w:pPr>
+      <w:r>
+        <w:t xml:space="preserve">Figura </w:t>
+      </w:r>
+      <w:fldSimple w:instr=" SEQ Figura \* ARABIC ">
+        <w:r>
+          <w:rPr>
+            <w:noProof/>
+          </w:rPr>
+          <w:t>20</w:t>
+        </w:r>
+      </w:fldSimple>
+      <w:r>
+        <w:t xml:space="preserve"> - </w:t>
+      </w:r>
+      <w:r>
+        <w:t xml:space="preserve">Apólices CRUD, Correção versão PHP e Correção dos nomes dos </w:t>
+      </w:r>
+      <w:proofErr w:type="spellStart"/>
+      <w:r>
+        <w:t>Controllers</w:t>
+      </w:r>
+      <w:proofErr w:type="spellEnd"/>
+      <w:r>
+        <w:t>.</w:t>
+      </w:r>
+    </w:p>
+    <w:p>
+      <w:pPr>
+        <w:pStyle w:val="ImagemTCC2026"/>
+        <w:keepNext/>
+      </w:pPr>
+      <w:r>
+        <w:drawing>
+          <wp:inline distT="0" distB="0" distL="0" distR="0" wp14:anchorId="03F55F00" wp14:editId="3E90A422">
+            <wp:extent cx="5836285" cy="1128395"/>
+            <wp:effectExtent l="0" t="0" r="0" b="0"/>
+            <wp:docPr id="20" name="Imagem 20"/>
+            <wp:cNvGraphicFramePr>
+              <a:graphicFrameLocks xmlns:a="http://schemas.openxmlformats.org/drawingml/2006/main" noChangeAspect="1"/>
+            </wp:cNvGraphicFramePr>
+            <a:graphic xmlns:a="http://schemas.openxmlformats.org/drawingml/2006/main">
+              <a:graphicData uri="http://schemas.openxmlformats.org/drawingml/2006/picture">
+                <pic:pic xmlns:pic="http://schemas.openxmlformats.org/drawingml/2006/picture">
+                  <pic:nvPicPr>
+                    <pic:cNvPr id="1" name=""/>
+                    <pic:cNvPicPr/>
+                  </pic:nvPicPr>
+                  <pic:blipFill>
+                    <a:blip r:embed="rId30"/>
+                    <a:stretch>
+                      <a:fillRect/>
+                    </a:stretch>
+                  </pic:blipFill>
+                  <pic:spPr>
+                    <a:xfrm>
+                      <a:off x="0" y="0"/>
+                      <a:ext cx="5836285" cy="1128395"/>
+                    </a:xfrm>
+                    <a:prstGeom prst="rect">
+                      <a:avLst/>
+                    </a:prstGeom>
+                  </pic:spPr>
+                </pic:pic>
+              </a:graphicData>
+            </a:graphic>
+          </wp:inline>
+        </w:drawing>
+      </w:r>
+    </w:p>
+    <w:p>
+      <w:pPr>
+        <w:pStyle w:val="FonteTCC2025"/>
+      </w:pPr>
+      <w:r>
+        <w:t>Fonte: Print do Aplicativo do GitHub</w:t>
+      </w:r>
+    </w:p>
+    <w:p/>
     <w:p/>
     <w:p/>
     <w:p>
@@ -6145,7 +7354,7 @@
       <w:r>
         <w:br/>
       </w:r>
-      <w:hyperlink r:id="rId24" w:history="1">
+      <w:hyperlink r:id="rId31" w:history="1">
         <w:r>
           <w:rPr>
             <w:rStyle w:val="Hyperlink"/>
@@ -6169,9 +7378,17 @@
         <w:t>FIGMA.</w:t>
       </w:r>
       <w:r>
-        <w:t xml:space="preserve"> Figma – Ferramenta colaborativa de design de interfaces. Disponível em: </w:t>
-      </w:r>
-      <w:hyperlink r:id="rId25" w:history="1">
+        <w:t xml:space="preserve"> </w:t>
+      </w:r>
+      <w:proofErr w:type="spellStart"/>
+      <w:r>
+        <w:t>Figma</w:t>
+      </w:r>
+      <w:proofErr w:type="spellEnd"/>
+      <w:r>
+        <w:t xml:space="preserve"> – Ferramenta colaborativa de design de interfaces. Disponível em: </w:t>
+      </w:r>
+      <w:hyperlink r:id="rId32" w:history="1">
         <w:r>
           <w:rPr>
             <w:rStyle w:val="Hyperlink"/>
@@ -6195,9 +7412,25 @@
         <w:t>ATLASSIAN.</w:t>
       </w:r>
       <w:r>
-        <w:t xml:space="preserve"> Trello – Gerenciamento de projetos e quadros Kanban. Disponível em: </w:t>
-      </w:r>
-      <w:hyperlink r:id="rId26" w:history="1">
+        <w:t xml:space="preserve"> </w:t>
+      </w:r>
+      <w:proofErr w:type="spellStart"/>
+      <w:r>
+        <w:t>Trello</w:t>
+      </w:r>
+      <w:proofErr w:type="spellEnd"/>
+      <w:r>
+        <w:t xml:space="preserve"> – Gerenciamento de projetos e quadros </w:t>
+      </w:r>
+      <w:proofErr w:type="spellStart"/>
+      <w:r>
+        <w:t>Kanban</w:t>
+      </w:r>
+      <w:proofErr w:type="spellEnd"/>
+      <w:r>
+        <w:t xml:space="preserve">. Disponível em: </w:t>
+      </w:r>
+      <w:hyperlink r:id="rId33" w:history="1">
         <w:r>
           <w:rPr>
             <w:rStyle w:val="Hyperlink"/>
@@ -6233,9 +7466,17 @@
         <w:t>CANVA.</w:t>
       </w:r>
       <w:r>
-        <w:t xml:space="preserve"> Canva – Plataforma de criação visual. Disponível em: </w:t>
-      </w:r>
-      <w:hyperlink r:id="rId27" w:history="1">
+        <w:t xml:space="preserve"> </w:t>
+      </w:r>
+      <w:proofErr w:type="spellStart"/>
+      <w:r>
+        <w:t>Canva</w:t>
+      </w:r>
+      <w:proofErr w:type="spellEnd"/>
+      <w:r>
+        <w:t xml:space="preserve"> – Plataforma de criação visual. Disponível em: </w:t>
+      </w:r>
+      <w:hyperlink r:id="rId34" w:history="1">
         <w:r>
           <w:rPr>
             <w:rStyle w:val="Hyperlink"/>
@@ -6285,7 +7526,7 @@
       <w:r>
         <w:t xml:space="preserve"> – Hospedagem de código e controle de versão. Disponível em: </w:t>
       </w:r>
-      <w:hyperlink r:id="rId28" w:history="1">
+      <w:hyperlink r:id="rId35" w:history="1">
         <w:r>
           <w:rPr>
             <w:rStyle w:val="Hyperlink"/>
@@ -6314,8 +7555,13 @@
       <w:r>
         <w:t xml:space="preserve"> </w:t>
       </w:r>
-      <w:r>
-        <w:t>abrl. 2026</w:t>
+      <w:proofErr w:type="spellStart"/>
+      <w:r>
+        <w:t>abrl</w:t>
+      </w:r>
+      <w:proofErr w:type="spellEnd"/>
+      <w:r>
+        <w:t>. 2026</w:t>
       </w:r>
       <w:r>
         <w:t>.</w:t>
@@ -6333,9 +7579,17 @@
         <w:t>GIT.</w:t>
       </w:r>
       <w:r>
-        <w:t xml:space="preserve"> Git – Sistema de controle de versão distribuído. Disponível em: </w:t>
-      </w:r>
-      <w:hyperlink r:id="rId29" w:history="1">
+        <w:t xml:space="preserve"> </w:t>
+      </w:r>
+      <w:proofErr w:type="spellStart"/>
+      <w:r>
+        <w:t>Git</w:t>
+      </w:r>
+      <w:proofErr w:type="spellEnd"/>
+      <w:r>
+        <w:t xml:space="preserve"> – Sistema de controle de versão distribuído. Disponível em: </w:t>
+      </w:r>
+      <w:hyperlink r:id="rId36" w:history="1">
         <w:r>
           <w:rPr>
             <w:rStyle w:val="Hyperlink"/>
@@ -6371,9 +7625,17 @@
         <w:t>FLATICON.</w:t>
       </w:r>
       <w:r>
-        <w:t xml:space="preserve"> Flaticon – Ícones Vetoriais. Disponível em: </w:t>
-      </w:r>
-      <w:hyperlink r:id="rId30" w:history="1">
+        <w:t xml:space="preserve"> </w:t>
+      </w:r>
+      <w:proofErr w:type="spellStart"/>
+      <w:r>
+        <w:t>Flaticon</w:t>
+      </w:r>
+      <w:proofErr w:type="spellEnd"/>
+      <w:r>
+        <w:t xml:space="preserve"> – Ícones Vetoriais. Disponível em: </w:t>
+      </w:r>
+      <w:hyperlink r:id="rId37" w:history="1">
         <w:r>
           <w:rPr>
             <w:rStyle w:val="Hyperlink"/>
@@ -6397,9 +7659,17 @@
         <w:t>ICONFINDER.</w:t>
       </w:r>
       <w:r>
-        <w:t xml:space="preserve"> Iconfinder – Ícones e vetores. Disponível em: </w:t>
-      </w:r>
-      <w:hyperlink r:id="rId31" w:history="1">
+        <w:t xml:space="preserve"> </w:t>
+      </w:r>
+      <w:proofErr w:type="spellStart"/>
+      <w:r>
+        <w:t>Iconfinder</w:t>
+      </w:r>
+      <w:proofErr w:type="spellEnd"/>
+      <w:r>
+        <w:t xml:space="preserve"> – Ícones e vetores. Disponível em: </w:t>
+      </w:r>
+      <w:hyperlink r:id="rId38" w:history="1">
         <w:r>
           <w:rPr>
             <w:rStyle w:val="Hyperlink"/>
@@ -6423,9 +7693,17 @@
         <w:t>PHOTOPEA.</w:t>
       </w:r>
       <w:r>
-        <w:t xml:space="preserve"> Photopea – Editor de imagens online. Disponível em: </w:t>
-      </w:r>
-      <w:hyperlink r:id="rId32" w:history="1">
+        <w:t xml:space="preserve"> </w:t>
+      </w:r>
+      <w:proofErr w:type="spellStart"/>
+      <w:r>
+        <w:t>Photopea</w:t>
+      </w:r>
+      <w:proofErr w:type="spellEnd"/>
+      <w:r>
+        <w:t xml:space="preserve"> – Editor de imagens online. Disponível em: </w:t>
+      </w:r>
+      <w:hyperlink r:id="rId39" w:history="1">
         <w:r>
           <w:rPr>
             <w:rStyle w:val="Hyperlink"/>
@@ -6449,9 +7727,17 @@
         <w:t>BRMODELO.</w:t>
       </w:r>
       <w:r>
-        <w:t xml:space="preserve"> brModelo Web – Ferramenta de modelagem de banco de dados. Disponível em: </w:t>
-      </w:r>
-      <w:hyperlink r:id="rId33" w:history="1">
+        <w:t xml:space="preserve"> </w:t>
+      </w:r>
+      <w:proofErr w:type="spellStart"/>
+      <w:r>
+        <w:t>brModelo</w:t>
+      </w:r>
+      <w:proofErr w:type="spellEnd"/>
+      <w:r>
+        <w:t xml:space="preserve"> Web – Ferramenta de modelagem de banco de dados. Disponível em: </w:t>
+      </w:r>
+      <w:hyperlink r:id="rId40" w:history="1">
         <w:r>
           <w:rPr>
             <w:rStyle w:val="Hyperlink"/>
@@ -6475,9 +7761,17 @@
         <w:t>LARAVEL.</w:t>
       </w:r>
       <w:r>
-        <w:t xml:space="preserve"> Laravel – Framework PHP para desenvolvimento web. Disponível em: </w:t>
-      </w:r>
-      <w:hyperlink r:id="rId34" w:history="1">
+        <w:t xml:space="preserve"> </w:t>
+      </w:r>
+      <w:proofErr w:type="spellStart"/>
+      <w:r>
+        <w:t>Laravel</w:t>
+      </w:r>
+      <w:proofErr w:type="spellEnd"/>
+      <w:r>
+        <w:t xml:space="preserve"> – Framework PHP para desenvolvimento web. Disponível em: </w:t>
+      </w:r>
+      <w:hyperlink r:id="rId41" w:history="1">
         <w:r>
           <w:rPr>
             <w:rStyle w:val="Hyperlink"/>
@@ -6504,9 +7798,25 @@
         <w:t>PUSHER.</w:t>
       </w:r>
       <w:r>
-        <w:t xml:space="preserve"> Pusher – Biblioteca para WebSockets e mensagens em tempo real. Disponível em: </w:t>
-      </w:r>
-      <w:hyperlink r:id="rId35" w:history="1">
+        <w:t xml:space="preserve"> </w:t>
+      </w:r>
+      <w:proofErr w:type="spellStart"/>
+      <w:r>
+        <w:t>Pusher</w:t>
+      </w:r>
+      <w:proofErr w:type="spellEnd"/>
+      <w:r>
+        <w:t xml:space="preserve"> – Biblioteca para </w:t>
+      </w:r>
+      <w:proofErr w:type="spellStart"/>
+      <w:r>
+        <w:t>WebSockets</w:t>
+      </w:r>
+      <w:proofErr w:type="spellEnd"/>
+      <w:r>
+        <w:t xml:space="preserve"> e mensagens em tempo real. Disponível em: </w:t>
+      </w:r>
+      <w:hyperlink r:id="rId42" w:history="1">
         <w:r>
           <w:rPr>
             <w:rStyle w:val="Hyperlink"/>
@@ -6535,7 +7845,7 @@
       <w:r>
         <w:t xml:space="preserve"> Gemini – Ferramenta de IA para textos e análises. Disponível em: </w:t>
       </w:r>
-      <w:hyperlink r:id="rId36" w:history="1">
+      <w:hyperlink r:id="rId43" w:history="1">
         <w:r>
           <w:rPr>
             <w:rStyle w:val="Hyperlink"/>
@@ -6559,30 +7869,20 @@
         <w:rPr>
           <w:rStyle w:val="Forte"/>
         </w:rPr>
-        <w:t>SUPABASE</w:t>
-      </w:r>
-      <w:r>
-        <w:rPr>
-          <w:rStyle w:val="Forte"/>
-        </w:rPr>
-        <w:t>.</w:t>
+        <w:t>SUPABASE.</w:t>
       </w:r>
       <w:r>
         <w:t xml:space="preserve"> </w:t>
       </w:r>
+      <w:proofErr w:type="spellStart"/>
       <w:r>
         <w:t>Supabase</w:t>
       </w:r>
-      <w:r>
-        <w:t xml:space="preserve"> – </w:t>
-      </w:r>
-      <w:r>
-        <w:t>Hospedagem do Banco De Dados</w:t>
-      </w:r>
-      <w:r>
-        <w:t xml:space="preserve">. Disponível em: </w:t>
-      </w:r>
-      <w:hyperlink r:id="rId37" w:history="1">
+      <w:proofErr w:type="spellEnd"/>
+      <w:r>
+        <w:t xml:space="preserve"> – Hospedagem do Banco De Dados. Disponível em: </w:t>
+      </w:r>
+      <w:hyperlink r:id="rId44" w:history="1">
         <w:r>
           <w:rPr>
             <w:rStyle w:val="Hyperlink"/>
@@ -6593,25 +7893,7 @@
         </w:r>
       </w:hyperlink>
       <w:r>
-        <w:t xml:space="preserve">. Acesso em: </w:t>
-      </w:r>
-      <w:r>
-        <w:t>12</w:t>
-      </w:r>
-      <w:r>
-        <w:t xml:space="preserve"> </w:t>
-      </w:r>
-      <w:r>
-        <w:t>maio</w:t>
-      </w:r>
-      <w:r>
-        <w:t xml:space="preserve"> 202</w:t>
-      </w:r>
-      <w:r>
-        <w:t>6</w:t>
-      </w:r>
-      <w:r>
-        <w:t xml:space="preserve">. </w:t>
+        <w:t xml:space="preserve">. Acesso em: 12 maio 2026. </w:t>
       </w:r>
     </w:p>
     <w:p>
@@ -7751,7 +9033,6 @@
   <w:style w:type="character" w:default="1" w:styleId="Fontepargpadro">
     <w:name w:val="Default Paragraph Font"/>
     <w:uiPriority w:val="1"/>
-    <w:semiHidden/>
     <w:unhideWhenUsed/>
   </w:style>
   <w:style w:type="table" w:default="1" w:styleId="Tabelanormal">
@@ -7921,7 +9202,7 @@
     <w:link w:val="FiguraTCCChar"/>
     <w:autoRedefine/>
     <w:qFormat/>
-    <w:rsid w:val="0010727E"/>
+    <w:rsid w:val="005548C9"/>
     <w:pPr>
       <w:keepNext/>
       <w:spacing w:line="240" w:lineRule="auto"/>
@@ -7949,7 +9230,7 @@
     <w:name w:val="FiguraTCC Char"/>
     <w:basedOn w:val="LegendaChar"/>
     <w:link w:val="FiguraTCC"/>
-    <w:rsid w:val="0010727E"/>
+    <w:rsid w:val="005548C9"/>
     <w:rPr>
       <w:rFonts w:ascii="Times New Roman" w:eastAsia="Times New Roman" w:hAnsi="Times New Roman" w:cs="Times New Roman"/>
       <w:iCs w:val="0"/>
@@ -8237,6 +9518,18 @@
       <w:shd w:val="clear" w:color="auto" w:fill="E1DFDD"/>
     </w:rPr>
   </w:style>
+  <w:style w:type="character" w:styleId="MenoPendente">
+    <w:name w:val="Unresolved Mention"/>
+    <w:basedOn w:val="Fontepargpadro"/>
+    <w:uiPriority w:val="99"/>
+    <w:semiHidden/>
+    <w:unhideWhenUsed/>
+    <w:rsid w:val="00EB1EC6"/>
+    <w:rPr>
+      <w:color w:val="605E5C"/>
+      <w:shd w:val="clear" w:color="auto" w:fill="E1DFDD"/>
+    </w:rPr>
+  </w:style>
 </w:styles>
 </file>
 

</xml_diff>